<commit_message>
Initial upload from local project
</commit_message>
<xml_diff>
--- a/23CT113_Nhom02_NenTangCrowdfunding(TuTeFund)/Test Plan_23CT113_Nhom02.docx
+++ b/23CT113_Nhom02_NenTangCrowdfunding(TuTeFund)/Test Plan_23CT113_Nhom02.docx
@@ -57,43 +57,39 @@
       </w:r>
     </w:p>
     <w:p>
+      <w:pPr/>
       <w:r>
-        <w:t>- Đăng ký / đăng nhập / quên mật khẩu / xác thực người dùng.</w:t>
+        <w:t>Phase 1 tập trung kiểm thử 5 module đã thiết kế test case (24 Test Requirement / 54 Test Case):</w:t>
       </w:r>
     </w:p>
     <w:p>
+      <w:pPr/>
       <w:r>
-        <w:t>- Tạo, chỉnh sửa, xóa, công khai và đóng chiến dịch gây quỹ.</w:t>
+        <w:t>- Login: đăng nhập hợp lệ, email hoa/thường, sai mật khẩu, email không tồn tại, ghi nhớ đăng nhập, đăng xuất, xác thực định dạng email, xác thực mật khẩu trống, tài khoản bị khóa, đăng nhập sai nhiều lần (10 TC).</w:t>
       </w:r>
     </w:p>
     <w:p>
+      <w:pPr/>
       <w:r>
-        <w:t>- Quản lý reward, mức đóng góp, giới hạn tối thiểu, tổng số tiền hiện tại và trạng thái chiến dịch.</w:t>
+        <w:t>- Reward: tạo reward hợp lệ, thiếu tên, giá âm, sửa tên/giá, xóa reward, hiển thị danh sách, số lượng có hạn mức, trừ số lượng sau khi backer chọn, mô tả quá độ dài (10 TC).</w:t>
       </w:r>
     </w:p>
     <w:p>
+      <w:pPr/>
       <w:r>
-        <w:t>- Theo dõi và đóng góp cho campaign, xác nhận thanh toán, hiển thị trạng thái đóng góp.</w:t>
+        <w:t>- Blog: tạo bài hợp lệ, thiếu tiêu đề, thiếu nội dung, sửa nội dung/tiêu đề, xóa bài, thứ tự hiển thị, upload ảnh, ảnh quá dung lượng, hiển thị cho khách (10 TC).</w:t>
       </w:r>
     </w:p>
     <w:p>
+      <w:pPr/>
       <w:r>
-        <w:t>- Blog / cập nhật chiến dịch / bình luận / phản hồi của người dùng.</w:t>
+        <w:t>- Campaign: tạo campaign hợp lệ, thiếu tên, mục tiêu âm, sửa mô tả/mục tiêu, hiển thị danh sách, tìm kiếm theo tên, đổi trạng thái Paused/Completed, tính tiến độ gây quỹ, thời gian quá ngắn, lọc theo danh mục (12 TC).</w:t>
       </w:r>
     </w:p>
     <w:p>
+      <w:pPr/>
       <w:r>
-        <w:t>- KYC và xác minh danh tính của người tạo campaign.</w:t>
-      </w:r>
-    </w:p>
-    <w:p>
-      <w:r>
-        <w:t>- Quản trị viên quản lý users, campaign, báo cáo, đánh dấu vi phạm và duyệt nội dung.</w:t>
-      </w:r>
-    </w:p>
-    <w:p>
-      <w:r>
-        <w:t>- Đảm bảo tính khả dụng, nhất quán giao diện, phản hồi rõ ràng và xử lý lỗi hợp lý.</w:t>
+        <w:t>- KYC: upload giấy tờ hợp lệ (JPG/PDF), file quá dung lượng, sai định dạng, xem trạng thái Pending/Approved, admin duyệt/từ chối, thông báo duyệt/từ chối, upload nhiều file, xem lịch sử KYC (12 TC).</w:t>
       </w:r>
     </w:p>
     <w:p>
@@ -102,23 +98,33 @@
       </w:r>
     </w:p>
     <w:p>
+      <w:pPr/>
       <w:r>
-        <w:t>- Kiểm thử hiệu năng ở mức rất cao với tải lượng cực lớn hơn 1000 người dùng đồng thời.</w:t>
+        <w:t>- Đăng ký tài khoản, quên mật khẩu, đổi mật khẩu và trang hồ sơ cá nhân nâng cao.</w:t>
       </w:r>
     </w:p>
     <w:p>
+      <w:pPr/>
       <w:r>
-        <w:t>- Kiểm thử bảo mật chuyên sâu ở mức pentest đầy đủ.</w:t>
+        <w:t>- Luồng thanh toán thật với ngân hàng/ví điện tử bên ngoài hệ thống của dự án.</w:t>
       </w:r>
     </w:p>
     <w:p>
+      <w:pPr/>
       <w:r>
-        <w:t>- Kiểm thử trên toàn bộ thiết bị/OS di động không có môi trường xác định trước.</w:t>
+        <w:t>- Module quản trị mở rộng (duyệt blog/comment, badge, báo cáo vi phạm, audit log) và chat giữa thành viên.</w:t>
       </w:r>
     </w:p>
     <w:p>
+      <w:pPr/>
       <w:r>
-        <w:t>- Kiểm thử thanh toán thật với ngân hàng/ứng dụng ngoài hệ thống của dự án.</w:t>
+        <w:t>- Kiểm thử hiệu năng ở mức tải cực lớn (hơn 1000 người dùng đồng thời) và pentest bảo mật chuyên sâu.</w:t>
+      </w:r>
+    </w:p>
+    <w:p>
+      <w:pPr/>
+      <w:r>
+        <w:t>- Kiểm thử trên Safari, Edge và thiết bị di động không có trong môi trường xác định trước.</w:t>
       </w:r>
     </w:p>
     <w:p>
@@ -310,7 +316,129 @@
         <w:pStyle w:val="Heading1"/>
       </w:pPr>
       <w:r>
-        <w:t>8. Kế hoạch thực hiện kiểm thử</w:t>
+        <w:t>8. Mục tiêu chất lượng và tiêu chí hoàn thành</w:t>
+      </w:r>
+    </w:p>
+    <w:p>
+      <w:pPr/>
+      <w:r>
+        <w:t>8.1 Mục tiêu chất lượng</w:t>
+      </w:r>
+    </w:p>
+    <w:p>
+      <w:pPr/>
+      <w:r>
+        <w:t>- Bao phủ 100% Test Requirement (24 TR) bằng ít nhất một test case; tổng 54 test case cho 5 module.</w:t>
+      </w:r>
+    </w:p>
+    <w:p>
+      <w:pPr/>
+      <w:r>
+        <w:t>- Tỷ lệ Pass mục tiêu ≥ 90% cho các module đã hoàn thiện (Login, Reward).</w:t>
+      </w:r>
+    </w:p>
+    <w:p>
+      <w:pPr/>
+      <w:r>
+        <w:t>- 100% test case ưu tiên High phải được thực thi và có kết quả Pass/Fail kèm Actual Result.</w:t>
+      </w:r>
+    </w:p>
+    <w:p>
+      <w:pPr/>
+      <w:r>
+        <w:t>- Không còn lỗi mức Blocker/Critical ở các luồng must-have (đăng nhập, tạo campaign, reward, KYC) trước khi nghiệm thu.</w:t>
+      </w:r>
+    </w:p>
+    <w:p>
+      <w:pPr/>
+      <w:r>
+        <w:t>- Mọi test case Fail phải được ghi vào Bug Log kèm mức độ và trạng thái xử lý (Open/Fixed).</w:t>
+      </w:r>
+    </w:p>
+    <w:p>
+      <w:pPr/>
+      <w:r>
+        <w:t>8.2 Tiêu chí hoàn thành (Exit criteria)</w:t>
+      </w:r>
+    </w:p>
+    <w:p>
+      <w:pPr/>
+      <w:r>
+        <w:t>- Đã chạy 100% test case (54/54) và ghi Actual Result, Test Status cho từng test case.</w:t>
+      </w:r>
+    </w:p>
+    <w:p>
+      <w:pPr/>
+      <w:r>
+        <w:t>- Tỷ lệ Pass toàn bộ ≥ 90%; toàn bộ lỗi High/Critical đã sửa hoặc có cam kết thời gian sửa.</w:t>
+      </w:r>
+    </w:p>
+    <w:p>
+      <w:pPr/>
+      <w:r>
+        <w:t>- Ma trận truy xuất REQ ↔ TR ↔ TC được cập nhật: 100% TR (24/24) và 100% TC (54/54) đã liên kết; 25/26 REQ có test case, riêng REQ-CAMP-006 ngoài phạm vi Phase 1 và được ghi rõ trong ma trận.</w:t>
+      </w:r>
+    </w:p>
+    <w:p>
+      <w:pPr/>
+      <w:r>
+        <w:t>- Test Report có đủ: tóm tắt kết quả, phân tích lỗi, đánh giá và khuyến nghị.</w:t>
+      </w:r>
+    </w:p>
+    <w:p>
+      <w:pPr/>
+      <w:r>
+        <w:t>8.3 Tiêu chí tạm dừng (Suspend criteria)</w:t>
+      </w:r>
+    </w:p>
+    <w:p>
+      <w:pPr/>
+      <w:r>
+        <w:t>- Môi trường demo/local không truy cập được trong hơn một buổi làm việc.</w:t>
+      </w:r>
+    </w:p>
+    <w:p>
+      <w:pPr/>
+      <w:r>
+        <w:t>- Phát hiện lỗi Blocker khiến không thể chạy tiếp luồng nghiệp vụ chính.</w:t>
+      </w:r>
+    </w:p>
+    <w:p>
+      <w:pPr/>
+      <w:r>
+        <w:t>8.4 Tài nguyên và công cụ kiểm thử</w:t>
+      </w:r>
+    </w:p>
+    <w:p>
+      <w:pPr/>
+      <w:r>
+        <w:t>- Quản lý kiểm thử: Excel/Google Sheets (Test Cases, Traceability Matrix, Bug Log).</w:t>
+      </w:r>
+    </w:p>
+    <w:p>
+      <w:pPr/>
+      <w:r>
+        <w:t>- Tự động hoá đã có trong repo: Jest (npm test), Playwright (Chromium) và CI .github/workflows/platform-ci.yml.</w:t>
+      </w:r>
+    </w:p>
+    <w:p>
+      <w:pPr/>
+      <w:r>
+        <w:t>- Tài khoản kiểm thử: Guest, Backer, Creator (KYC pending/approved), Admin.</w:t>
+      </w:r>
+    </w:p>
+    <w:p>
+      <w:pPr/>
+      <w:r>
+        <w:t>- Môi trường: Windows 10/11, Chrome phiên bản mới nhất, demo Vercel và local.</w:t>
+      </w:r>
+    </w:p>
+    <w:p>
+      <w:pPr>
+        <w:pStyle w:val="Heading1"/>
+      </w:pPr>
+      <w:r>
+        <w:t>9. Kế hoạch thực hiện kiểm thử</w:t>
       </w:r>
     </w:p>
     <w:tbl>
@@ -541,7 +669,7 @@
         <w:pStyle w:val="Heading1"/>
       </w:pPr>
       <w:r>
-        <w:t>9. Các module cần kiểm tra</w:t>
+        <w:t>10. Các module cần kiểm tra</w:t>
       </w:r>
     </w:p>
     <w:p>
@@ -615,7 +743,7 @@
         <w:pStyle w:val="Heading1"/>
       </w:pPr>
       <w:r>
-        <w:t>10. Rủi ro và giả định</w:t>
+        <w:t>11. Rủi ro và giả định</w:t>
       </w:r>
     </w:p>
     <w:p>
@@ -643,7 +771,7 @@
         <w:pStyle w:val="Heading1"/>
       </w:pPr>
       <w:r>
-        <w:t>11. Kết luận</w:t>
+        <w:t>12. Kết luận</w:t>
       </w:r>
     </w:p>
     <w:p>
@@ -656,7 +784,7 @@
         <w:pStyle w:val="Heading1"/>
       </w:pPr>
       <w:r>
-        <w:t>12. Xác nhận</w:t>
+        <w:t>13. Xác nhận</w:t>
       </w:r>
     </w:p>
     <w:tbl>
@@ -780,6 +908,66 @@
           <w:p>
             <w:r>
               <w:t>Bùi Đặng Quốc Khánh</w:t>
+            </w:r>
+          </w:p>
+        </w:tc>
+        <w:tc>
+          <w:tcPr>
+            <w:tcW w:type="dxa" w:w="2880"/>
+          </w:tcPr>
+          <w:p>
+            <w:r/>
+          </w:p>
+        </w:tc>
+      </w:tr>
+      <w:tr>
+        <w:tc>
+          <w:tcPr>
+            <w:tcW w:type="dxa" w:w="2880"/>
+          </w:tcPr>
+          <w:p>
+            <w:r>
+              <w:t>Tester</w:t>
+            </w:r>
+          </w:p>
+        </w:tc>
+        <w:tc>
+          <w:tcPr>
+            <w:tcW w:type="dxa" w:w="2880"/>
+          </w:tcPr>
+          <w:p>
+            <w:r>
+              <w:t>Nguyễn Trung Tiến</w:t>
+            </w:r>
+          </w:p>
+        </w:tc>
+        <w:tc>
+          <w:tcPr>
+            <w:tcW w:type="dxa" w:w="2880"/>
+          </w:tcPr>
+          <w:p>
+            <w:r/>
+          </w:p>
+        </w:tc>
+      </w:tr>
+      <w:tr>
+        <w:tc>
+          <w:tcPr>
+            <w:tcW w:type="dxa" w:w="2880"/>
+          </w:tcPr>
+          <w:p>
+            <w:r>
+              <w:t>Tester</w:t>
+            </w:r>
+          </w:p>
+        </w:tc>
+        <w:tc>
+          <w:tcPr>
+            <w:tcW w:type="dxa" w:w="2880"/>
+          </w:tcPr>
+          <w:p>
+            <w:r>
+              <w:t>Nguyễn Khánh Du</w:t>
             </w:r>
           </w:p>
         </w:tc>

</xml_diff>

<commit_message>
Update project and test plan
</commit_message>
<xml_diff>
--- a/23CT113_Nhom02_NenTangCrowdfunding(TuTeFund)/Test Plan_23CT113_Nhom02.docx
+++ b/23CT113_Nhom02_NenTangCrowdfunding(TuTeFund)/Test Plan_23CT113_Nhom02.docx
@@ -12,22 +12,42 @@
     </w:p>
     <w:p>
       <w:r>
-        <w:t>Dự án: Nền tảng Crowdfunding (Tử Tế Fund)</w:t>
+        <w:t>Dự án: Nền tảng Gây quỹ Cộng đồng Tử Tế Fund (crowdfunding-vn)</w:t>
       </w:r>
     </w:p>
     <w:p>
       <w:r>
-        <w:t>Phiên bản: 1.0</w:t>
+        <w:t>Phiên bản: 2.0.0</w:t>
       </w:r>
     </w:p>
     <w:p>
       <w:r>
-        <w:t>Ngày lập: 27/10/2026</w:t>
+        <w:t>Ngày lập: 07/09/2026</w:t>
       </w:r>
     </w:p>
     <w:p>
       <w:r>
-        <w:t>Người lập: Nhóm 23CT113_Nhom02</w:t>
+        <w:t>Người lập: Nguyễn Quách Phú Tài (123000609) — Test Lead / Product Owner</w:t>
+      </w:r>
+    </w:p>
+    <w:p>
+      <w:r>
+        <w:t>Mã tài liệu: TP-23CT113-Nhom02</w:t>
+      </w:r>
+    </w:p>
+    <w:p>
+      <w:r>
+        <w:t>Nhóm: 23CT113 — Nhóm 02</w:t>
+      </w:r>
+    </w:p>
+    <w:p>
+      <w:r>
+        <w:t>Căn cứ: PRD 2.0.0 (01-IC-Product-Requirements_23CT113_Nhom02.md) và mã nguồn hệ thống</w:t>
+      </w:r>
+    </w:p>
+    <w:p>
+      <w:r>
+        <w:t>Phạm vi: 5 phân hệ — Login (Auth), Campaign, Reward, Blog, KYC</w:t>
       </w:r>
     </w:p>
     <w:p>
@@ -40,7 +60,32 @@
     </w:p>
     <w:p>
       <w:r>
-        <w:t>Mục tiêu của Test Plan này là xác nhận tính đúng đắn, đầy đủ và ổn định của hệ thống nền tảng crowdfunding Tử Tế Fund trước khi đưa vào sử dụng hoặc đánh giá cuối kỳ. Hệ thống cần kiểm tra các chức năng cốt lõi như đăng ký, đăng nhập, tạo chiến dịch, quản lý reward, đóng góp, blog, KYC, quản trị và báo cáo.</w:t>
+        <w:t>Mục tiêu của Test Plan này là xác nhận tính đúng đắn, đầy đủ và ổn định của hệ thống nền tảng crowdfunding Tử Tế Fund trước khi đưa vào sử dụng. Hệ thống cần đáp ứng đúng các tiêu chí chất lượng và quy trình kiểm thử được thống nhất trong nhóm.</w:t>
+      </w:r>
+    </w:p>
+    <w:p>
+      <w:r>
+        <w:t>Cụ thể, kế hoạch kiểm thử nhằm:</w:t>
+      </w:r>
+    </w:p>
+    <w:p>
+      <w:r>
+        <w:t>- Xác minh hệ thống đáp ứng 29 Requirement và 33 Test Requirement đã thống nhất trong workbook.</w:t>
+      </w:r>
+    </w:p>
+    <w:p>
+      <w:r>
+        <w:t>- Kiểm tra 75 Test Case trên 5 phân hệ: Login (Auth), Campaign, Reward, Blog và KYC.</w:t>
+      </w:r>
+    </w:p>
+    <w:p>
+      <w:r>
+        <w:t>- Phát hiện lỗi sớm trong các luồng must-have, đặc biệt là đăng nhập, tạo chiến dịch, gửi duyệt, quản lý reward và KYC.</w:t>
+      </w:r>
+    </w:p>
+    <w:p>
+      <w:r>
+        <w:t>- Tạo bằng chứng kiểm thử rõ ràng để hỗ trợ tổng hợp báo cáo và quyết định nghiệm thu.</w:t>
       </w:r>
     </w:p>
     <w:p>
@@ -52,79 +97,69 @@
       </w:r>
     </w:p>
     <w:p>
+      <w:pPr>
+        <w:pStyle w:val="Heading2"/>
+      </w:pPr>
       <w:r>
         <w:t>2.1 Trong phạm vi</w:t>
       </w:r>
     </w:p>
     <w:p>
-      <w:pPr/>
       <w:r>
-        <w:t>Phase 1 tập trung kiểm thử 5 module đã thiết kế test case (24 Test Requirement / 54 Test Case):</w:t>
+        <w:t>Phạm vi kiểm thử của Test Plan này bao gồm 5 phân hệ chính: Login (Auth), Campaign, Reward, Blog và KYC. Tổng số là 29 Requirement, 33 Test Requirement và 75 Test Case.</w:t>
       </w:r>
     </w:p>
     <w:p>
-      <w:pPr/>
       <w:r>
-        <w:t>- Login: đăng nhập hợp lệ, email hoa/thường, sai mật khẩu, email không tồn tại, ghi nhớ đăng nhập, đăng xuất, xác thực định dạng email, xác thực mật khẩu trống, tài khoản bị khóa, đăng nhập sai nhiều lần (10 TC).</w:t>
+        <w:t>- Login (Auth): đăng ký, đăng nhập, đặt lại mật khẩu, xác thực token, kiểm soát quyền truy cập và trạng thái tài khoản.</w:t>
       </w:r>
     </w:p>
     <w:p>
-      <w:pPr/>
       <w:r>
-        <w:t>- Reward: tạo reward hợp lệ, thiếu tên, giá âm, sửa tên/giá, xóa reward, hiển thị danh sách, số lượng có hạn mức, trừ số lượng sau khi backer chọn, mô tả quá độ dài (10 TC).</w:t>
+        <w:t>- Campaign: tạo, duyệt, cập nhật, đóng, lưu nháp, theo dõi tiến độ và xử lý trạng thái chiến dịch.</w:t>
       </w:r>
     </w:p>
     <w:p>
-      <w:pPr/>
       <w:r>
-        <w:t>- Blog: tạo bài hợp lệ, thiếu tiêu đề, thiếu nội dung, sửa nội dung/tiêu đề, xóa bài, thứ tự hiển thị, upload ảnh, ảnh quá dung lượng, hiển thị cho khách (10 TC).</w:t>
+        <w:t>- Reward: thêm gói quà, cập nhật thông tin, kiểm tra số lượng, kiểm soát giá trị và các trạng thái bị chặn.</w:t>
       </w:r>
     </w:p>
     <w:p>
-      <w:pPr/>
       <w:r>
-        <w:t>- Campaign: tạo campaign hợp lệ, thiếu tên, mục tiêu âm, sửa mô tả/mục tiêu, hiển thị danh sách, tìm kiếm theo tên, đổi trạng thái Paused/Completed, tính tiến độ gây quỹ, thời gian quá ngắn, lọc theo danh mục (12 TC).</w:t>
+        <w:t>- Blog: tạo bài, lưu nháp, duyệt, cập nhật, xóa, kiểm tra định dạng, upload media và quyền hiển thị.</w:t>
       </w:r>
     </w:p>
     <w:p>
-      <w:pPr/>
       <w:r>
-        <w:t>- KYC: upload giấy tờ hợp lệ (JPG/PDF), file quá dung lượng, sai định dạng, xem trạng thái Pending/Approved, admin duyệt/từ chối, thông báo duyệt/từ chối, upload nhiều file, xem lịch sử KYC (12 TC).</w:t>
+        <w:t>- KYC: upload giấy tờ, kiểm tra loại tệp, trạng thái duyệt, báo cáo từ chối, xác minh thông tin và hồ sơ của người dùng.</w:t>
       </w:r>
     </w:p>
     <w:p>
+      <w:pPr>
+        <w:pStyle w:val="Heading2"/>
+      </w:pPr>
       <w:r>
         <w:t>2.2 Ngoài phạm vi</w:t>
       </w:r>
     </w:p>
     <w:p>
-      <w:pPr/>
       <w:r>
-        <w:t>- Đăng ký tài khoản, quên mật khẩu, đổi mật khẩu và trang hồ sơ cá nhân nâng cao.</w:t>
+        <w:t>- Thanh toán thật với ngân hàng, ví điện tử hoặc cổng thanh toán bên ngoài hệ thống; chỉ kiểm thử luồng giao diện và ràng buộc dữ liệu.</w:t>
       </w:r>
     </w:p>
     <w:p>
-      <w:pPr/>
       <w:r>
-        <w:t>- Luồng thanh toán thật với ngân hàng/ví điện tử bên ngoài hệ thống của dự án.</w:t>
+        <w:t>- Tối ưu hiệu năng với tải cực lớn và pentest bảo mật chuyên sâu, không thuộc phạm vi của Test Plan này.</w:t>
       </w:r>
     </w:p>
     <w:p>
-      <w:pPr/>
       <w:r>
-        <w:t>- Module quản trị mở rộng (duyệt blog/comment, badge, báo cáo vi phạm, audit log) và chat giữa thành viên.</w:t>
+        <w:t>- Quản trị mở rộng như badge, báo cáo vi phạm, chat và audit log không nằm trong vòng kiểm thử Phase 1.</w:t>
       </w:r>
     </w:p>
     <w:p>
-      <w:pPr/>
       <w:r>
-        <w:t>- Kiểm thử hiệu năng ở mức tải cực lớn (hơn 1000 người dùng đồng thời) và pentest bảo mật chuyên sâu.</w:t>
-      </w:r>
-    </w:p>
-    <w:p>
-      <w:pPr/>
-      <w:r>
-        <w:t>- Kiểm thử trên Safari, Edge và thiết bị di động không có trong môi trường xác định trước.</w:t>
+        <w:t>- Safari, thiết bị di động không xác định trước và các môi trường mới chưa được chuẩn bị; sẽ bổ sung nếu có thêm yêu cầu phát triển.</w:t>
       </w:r>
     </w:p>
     <w:p>
@@ -137,46 +172,22 @@
     </w:p>
     <w:p>
       <w:r>
-        <w:rPr>
-          <w:b/>
-        </w:rPr>
-        <w:t xml:space="preserve">Người dùng thông thường: </w:t>
-      </w:r>
-      <w:r>
-        <w:t>Đăng ký, đăng nhập, xem chiến dịch, theo dõi, đóng góp, nhận thông báo và quản lý hồ sơ cá nhân.</w:t>
+        <w:t>Người dùng thông thường: đăng ký, đăng nhập, xem chiến dịch, theo dõi tiến độ, đóng góp, xem blog và quản lý hồ sơ cá nhân.</w:t>
       </w:r>
     </w:p>
     <w:p>
       <w:r>
-        <w:rPr>
-          <w:b/>
-        </w:rPr>
-        <w:t xml:space="preserve">Người sáng tạo chiến dịch: </w:t>
-      </w:r>
-      <w:r>
-        <w:t>Tạo campaign, cập nhật thông tin, upload hình ảnh, quản lý reward, theo dõi tiến độ, gửi cập nhật.</w:t>
+        <w:t>Người sáng tạo chiến dịch: tạo chiến dịch, cập nhật thông tin, quản lý reward, thao tác trạng thái chiến dịch, gửi yêu cầu duyệt và theo dõi tiến độ gây quỹ.</w:t>
       </w:r>
     </w:p>
     <w:p>
       <w:r>
-        <w:rPr>
-          <w:b/>
-        </w:rPr>
-        <w:t xml:space="preserve">Quản trị viên: </w:t>
-      </w:r>
-      <w:r>
-        <w:t>Duyệt campaign, kiểm duyệt nội dung, quản lý tài khoản, theo dõi báo cáo, xử lý vi phạm.</w:t>
+        <w:t>Người ủng hộ: chọn reward, thực hiện đóng góp, xem lịch sử, xem chiến dịch và nhận thông báo khi kết quả chiến dịch thay đổi.</w:t>
       </w:r>
     </w:p>
     <w:p>
       <w:r>
-        <w:rPr>
-          <w:b/>
-        </w:rPr>
-        <w:t xml:space="preserve">Người ủng hộ: </w:t>
-      </w:r>
-      <w:r>
-        <w:t>Chọn reward, thực hiện đóng góp, xem lịch sử đóng góp, yêu cầu hóa đơn/certificate.</w:t>
+        <w:t>Quản trị viên: duyệt campaign, xử lý KYC, kiểm duyệt nội dung, quản lý tài khoản, theo dõi báo cáo và xử lý vi phạm.</w:t>
       </w:r>
     </w:p>
     <w:p>
@@ -188,35 +199,391 @@
       </w:r>
     </w:p>
     <w:p>
+      <w:pPr>
+        <w:pStyle w:val="Heading2"/>
+      </w:pPr>
       <w:r>
-        <w:t>- Tài khoản người dùng gồm Guest, Regular User, Creator, Admin.</w:t>
+        <w:t>4.1 Nguyên tắc dữ liệu</w:t>
       </w:r>
     </w:p>
     <w:p>
       <w:r>
-        <w:t>- Ít nhất 3-5 chiến dịch ở các trạng thái: Draft, Review, Active, Successful, Failed, Closed.</w:t>
+        <w:t>- Không dùng thông tin cá nhân thật. Tất cả ảnh giấy tờ, tài khoản và dữ liệu đầu vào phải là dữ liệu giả lập hoặc mẫu.</w:t>
       </w:r>
     </w:p>
     <w:p>
       <w:r>
-        <w:t>- Reward với mức đóng góp khác nhau và các trường hợp giới hạn khác nhau.</w:t>
+        <w:t>- Mỗi vòng kiểm thử phải seed lại dữ liệu trước khi bắt đầu để đảm bảo độ nhất quán và không làm lệch kết quả.</w:t>
       </w:r>
     </w:p>
     <w:p>
       <w:r>
-        <w:t>- Campaign có hình ảnh, video, mô tả dài, tags, category và metadata.</w:t>
+        <w:t>- Mỗi test case phải ghi rõ Test Data trong workbook để có thể lặp lại và đối chiếu dễ dàng.</w:t>
       </w:r>
     </w:p>
     <w:p>
+      <w:pPr>
+        <w:pStyle w:val="Heading2"/>
+      </w:pPr>
       <w:r>
-        <w:t>- Các trường hợp KYC: chờ xác minh, đã duyệt, từ chối, cần bổ sung thông tin.</w:t>
+        <w:t>4.2 Bộ dữ liệu theo phân hệ</w:t>
       </w:r>
     </w:p>
+    <w:tbl>
+      <w:tblPr>
+        <w:tblStyle w:val="TableGrid"/>
+        <w:tblW w:type="auto" w:w="0"/>
+        <w:tblLook w:firstColumn="1" w:firstRow="1" w:lastColumn="0" w:lastRow="0" w:noHBand="0" w:noVBand="1" w:val="04A0"/>
+      </w:tblPr>
+      <w:tblGrid>
+        <w:gridCol w:w="4320"/>
+        <w:gridCol w:w="4320"/>
+      </w:tblGrid>
+      <w:tr>
+        <w:tc>
+          <w:tcPr>
+            <w:tcW w:type="dxa" w:w="4320"/>
+          </w:tcPr>
+          <w:p>
+            <w:r>
+              <w:t>Phân hệ</w:t>
+            </w:r>
+          </w:p>
+        </w:tc>
+        <w:tc>
+          <w:tcPr>
+            <w:tcW w:type="dxa" w:w="4320"/>
+          </w:tcPr>
+          <w:p>
+            <w:r>
+              <w:t>Dữ liệu cần chuẩn bị</w:t>
+            </w:r>
+          </w:p>
+        </w:tc>
+      </w:tr>
+      <w:tr>
+        <w:tc>
+          <w:tcPr>
+            <w:tcW w:type="dxa" w:w="4320"/>
+          </w:tcPr>
+          <w:p>
+            <w:r>
+              <w:t>Login (Auth)</w:t>
+            </w:r>
+          </w:p>
+        </w:tc>
+        <w:tc>
+          <w:tcPr>
+            <w:tcW w:type="dxa" w:w="4320"/>
+          </w:tcPr>
+          <w:p>
+            <w:r>
+              <w:t>Tài khoản hợp lệ, tài khoản đã tồn tại, mật khẩu thiếu, mật khẩu sai, token đặt lại mật khẩu còn hiệu lực/expired.</w:t>
+            </w:r>
+          </w:p>
+        </w:tc>
+      </w:tr>
+      <w:tr>
+        <w:tc>
+          <w:tcPr>
+            <w:tcW w:type="dxa" w:w="4320"/>
+          </w:tcPr>
+          <w:p>
+            <w:r>
+              <w:t>Campaign</w:t>
+            </w:r>
+          </w:p>
+        </w:tc>
+        <w:tc>
+          <w:tcPr>
+            <w:tcW w:type="dxa" w:w="4320"/>
+          </w:tcPr>
+          <w:p>
+            <w:r>
+              <w:t>Chiến dịch ở trạng thái Draft, Pending Review, Active, Success, Failed; có và không có reward; slug và campaignCode có trùng lặp.</w:t>
+            </w:r>
+          </w:p>
+        </w:tc>
+      </w:tr>
+      <w:tr>
+        <w:tc>
+          <w:tcPr>
+            <w:tcW w:type="dxa" w:w="4320"/>
+          </w:tcPr>
+          <w:p>
+            <w:r>
+              <w:t>Reward</w:t>
+            </w:r>
+          </w:p>
+        </w:tc>
+        <w:tc>
+          <w:tcPr>
+            <w:tcW w:type="dxa" w:w="4320"/>
+          </w:tcPr>
+          <w:p>
+            <w:r>
+              <w:t>Reward hợp lệ, các giá trị minAmount 0/âm, stock null/0/5, loại PHYSICAL và DOWNLOAD.</w:t>
+            </w:r>
+          </w:p>
+        </w:tc>
+      </w:tr>
+      <w:tr>
+        <w:tc>
+          <w:tcPr>
+            <w:tcW w:type="dxa" w:w="4320"/>
+          </w:tcPr>
+          <w:p>
+            <w:r>
+              <w:t>Blog</w:t>
+            </w:r>
+          </w:p>
+        </w:tc>
+        <w:tc>
+          <w:tcPr>
+            <w:tcW w:type="dxa" w:w="4320"/>
+          </w:tcPr>
+          <w:p>
+            <w:r>
+              <w:t>Bài ở DRAFT, PENDING_REVIEW, PUBLISHED với publishedAt trong quá khứ và tương lai; payload có thẻ script.</w:t>
+            </w:r>
+          </w:p>
+        </w:tc>
+      </w:tr>
+      <w:tr>
+        <w:tc>
+          <w:tcPr>
+            <w:tcW w:type="dxa" w:w="4320"/>
+          </w:tcPr>
+          <w:p>
+            <w:r>
+              <w:t>KYC</w:t>
+            </w:r>
+          </w:p>
+        </w:tc>
+        <w:tc>
+          <w:tcPr>
+            <w:tcW w:type="dxa" w:w="4320"/>
+          </w:tcPr>
+          <w:p>
+            <w:r>
+              <w:t>Hồ sơ Pending, Verified, Rejected; ảnh JPG 4MB, ảnh JPG 6MB, file executables, video MP4 31MB.</w:t>
+            </w:r>
+          </w:p>
+        </w:tc>
+      </w:tr>
+    </w:tbl>
     <w:p>
+      <w:pPr>
+        <w:pStyle w:val="Heading2"/>
+      </w:pPr>
       <w:r>
-        <w:t>- Báo cáo vi phạm, comment và blog update với nội dung hợp lệ và không hợp lệ.</w:t>
+        <w:t>4.3 Tài khoản kiểm thử</w:t>
       </w:r>
     </w:p>
+    <w:tbl>
+      <w:tblPr>
+        <w:tblStyle w:val="TableGrid"/>
+        <w:tblW w:type="auto" w:w="0"/>
+        <w:tblLook w:firstColumn="1" w:firstRow="1" w:lastColumn="0" w:lastRow="0" w:noHBand="0" w:noVBand="1" w:val="04A0"/>
+      </w:tblPr>
+      <w:tblGrid>
+        <w:gridCol w:w="2880"/>
+        <w:gridCol w:w="2880"/>
+        <w:gridCol w:w="2880"/>
+      </w:tblGrid>
+      <w:tr>
+        <w:tc>
+          <w:tcPr>
+            <w:tcW w:type="dxa" w:w="2880"/>
+          </w:tcPr>
+          <w:p>
+            <w:r>
+              <w:t>Vai trò</w:t>
+            </w:r>
+          </w:p>
+        </w:tc>
+        <w:tc>
+          <w:tcPr>
+            <w:tcW w:type="dxa" w:w="2880"/>
+          </w:tcPr>
+          <w:p>
+            <w:r>
+              <w:t>Điều kiện</w:t>
+            </w:r>
+          </w:p>
+        </w:tc>
+        <w:tc>
+          <w:tcPr>
+            <w:tcW w:type="dxa" w:w="2880"/>
+          </w:tcPr>
+          <w:p>
+            <w:r>
+              <w:t>Dùng cho</w:t>
+            </w:r>
+          </w:p>
+        </w:tc>
+      </w:tr>
+      <w:tr>
+        <w:tc>
+          <w:tcPr>
+            <w:tcW w:type="dxa" w:w="2880"/>
+          </w:tcPr>
+          <w:p>
+            <w:r>
+              <w:t>Guest</w:t>
+            </w:r>
+          </w:p>
+        </w:tc>
+        <w:tc>
+          <w:tcPr>
+            <w:tcW w:type="dxa" w:w="2880"/>
+          </w:tcPr>
+          <w:p>
+            <w:r>
+              <w:t>Chưa đăng nhập</w:t>
+            </w:r>
+          </w:p>
+        </w:tc>
+        <w:tc>
+          <w:tcPr>
+            <w:tcW w:type="dxa" w:w="2880"/>
+          </w:tcPr>
+          <w:p>
+            <w:r>
+              <w:t>Xem danh sách công khai và cơ bản</w:t>
+            </w:r>
+          </w:p>
+        </w:tc>
+      </w:tr>
+      <w:tr>
+        <w:tc>
+          <w:tcPr>
+            <w:tcW w:type="dxa" w:w="2880"/>
+          </w:tcPr>
+          <w:p>
+            <w:r>
+              <w:t>Backer</w:t>
+            </w:r>
+          </w:p>
+        </w:tc>
+        <w:tc>
+          <w:tcPr>
+            <w:tcW w:type="dxa" w:w="2880"/>
+          </w:tcPr>
+          <w:p>
+            <w:r>
+              <w:t>role = BACKER</w:t>
+            </w:r>
+          </w:p>
+        </w:tc>
+        <w:tc>
+          <w:tcPr>
+            <w:tcW w:type="dxa" w:w="2880"/>
+          </w:tcPr>
+          <w:p>
+            <w:r>
+              <w:t>Đăng ký, ủng hộ, bình luận</w:t>
+            </w:r>
+          </w:p>
+        </w:tc>
+      </w:tr>
+      <w:tr>
+        <w:tc>
+          <w:tcPr>
+            <w:tcW w:type="dxa" w:w="2880"/>
+          </w:tcPr>
+          <w:p>
+            <w:r>
+              <w:t>Creator</w:t>
+            </w:r>
+          </w:p>
+        </w:tc>
+        <w:tc>
+          <w:tcPr>
+            <w:tcW w:type="dxa" w:w="2880"/>
+          </w:tcPr>
+          <w:p>
+            <w:r>
+              <w:t>role = CREATOR, KYC VERIFIED</w:t>
+            </w:r>
+          </w:p>
+        </w:tc>
+        <w:tc>
+          <w:tcPr>
+            <w:tcW w:type="dxa" w:w="2880"/>
+          </w:tcPr>
+          <w:p>
+            <w:r>
+              <w:t>Tạo và quản lý campaign</w:t>
+            </w:r>
+          </w:p>
+        </w:tc>
+      </w:tr>
+      <w:tr>
+        <w:tc>
+          <w:tcPr>
+            <w:tcW w:type="dxa" w:w="2880"/>
+          </w:tcPr>
+          <w:p>
+            <w:r>
+              <w:t>Creator chờ duyệt</w:t>
+            </w:r>
+          </w:p>
+        </w:tc>
+        <w:tc>
+          <w:tcPr>
+            <w:tcW w:type="dxa" w:w="2880"/>
+          </w:tcPr>
+          <w:p>
+            <w:r>
+              <w:t>role = CREATOR_PENDING</w:t>
+            </w:r>
+          </w:p>
+        </w:tc>
+        <w:tc>
+          <w:tcPr>
+            <w:tcW w:type="dxa" w:w="2880"/>
+          </w:tcPr>
+          <w:p>
+            <w:r>
+              <w:t>Kiểm tra giới hạn quyền</w:t>
+            </w:r>
+          </w:p>
+        </w:tc>
+      </w:tr>
+      <w:tr>
+        <w:tc>
+          <w:tcPr>
+            <w:tcW w:type="dxa" w:w="2880"/>
+          </w:tcPr>
+          <w:p>
+            <w:r>
+              <w:t>Admin</w:t>
+            </w:r>
+          </w:p>
+        </w:tc>
+        <w:tc>
+          <w:tcPr>
+            <w:tcW w:type="dxa" w:w="2880"/>
+          </w:tcPr>
+          <w:p>
+            <w:r>
+              <w:t>role = ADMIN hoặc isAdmin = true</w:t>
+            </w:r>
+          </w:p>
+        </w:tc>
+        <w:tc>
+          <w:tcPr>
+            <w:tcW w:type="dxa" w:w="2880"/>
+          </w:tcPr>
+          <w:p>
+            <w:r>
+              <w:t>Duyệt campaign, duyệt KYC và duyệt blog</w:t>
+            </w:r>
+          </w:p>
+        </w:tc>
+      </w:tr>
+    </w:tbl>
     <w:p>
       <w:pPr>
         <w:pStyle w:val="Heading1"/>
@@ -226,33 +593,352 @@
       </w:r>
     </w:p>
     <w:p>
+      <w:pPr>
+        <w:pStyle w:val="Heading2"/>
+      </w:pPr>
       <w:r>
-        <w:t>- Browser: Chrome và Edge phiên bản mới nhất.</w:t>
+        <w:t>5.1 Môi trường</w:t>
+      </w:r>
+    </w:p>
+    <w:tbl>
+      <w:tblPr>
+        <w:tblStyle w:val="TableGrid"/>
+        <w:tblW w:type="auto" w:w="0"/>
+        <w:tblLook w:firstColumn="1" w:firstRow="1" w:lastColumn="0" w:lastRow="0" w:noHBand="0" w:noVBand="1" w:val="04A0"/>
+      </w:tblPr>
+      <w:tblGrid>
+        <w:gridCol w:w="2880"/>
+        <w:gridCol w:w="2880"/>
+        <w:gridCol w:w="2880"/>
+      </w:tblGrid>
+      <w:tr>
+        <w:tc>
+          <w:tcPr>
+            <w:tcW w:type="dxa" w:w="2880"/>
+          </w:tcPr>
+          <w:p>
+            <w:r>
+              <w:t>Môi trường</w:t>
+            </w:r>
+          </w:p>
+        </w:tc>
+        <w:tc>
+          <w:tcPr>
+            <w:tcW w:type="dxa" w:w="2880"/>
+          </w:tcPr>
+          <w:p>
+            <w:r>
+              <w:t>Địa chỉ truy cập</w:t>
+            </w:r>
+          </w:p>
+        </w:tc>
+        <w:tc>
+          <w:tcPr>
+            <w:tcW w:type="dxa" w:w="2880"/>
+          </w:tcPr>
+          <w:p>
+            <w:r>
+              <w:t>Mục đích sử dụng</w:t>
+            </w:r>
+          </w:p>
+        </w:tc>
+      </w:tr>
+      <w:tr>
+        <w:tc>
+          <w:tcPr>
+            <w:tcW w:type="dxa" w:w="2880"/>
+          </w:tcPr>
+          <w:p>
+            <w:r>
+              <w:t>Local</w:t>
+            </w:r>
+          </w:p>
+        </w:tc>
+        <w:tc>
+          <w:tcPr>
+            <w:tcW w:type="dxa" w:w="2880"/>
+          </w:tcPr>
+          <w:p>
+            <w:r>
+              <w:t>http://localhost:3000 (npm run dev)</w:t>
+            </w:r>
+          </w:p>
+        </w:tc>
+        <w:tc>
+          <w:tcPr>
+            <w:tcW w:type="dxa" w:w="2880"/>
+          </w:tcPr>
+          <w:p>
+            <w:r>
+              <w:t>Phát triển và kiểm thử hồi quy nhanh</w:t>
+            </w:r>
+          </w:p>
+        </w:tc>
+      </w:tr>
+      <w:tr>
+        <w:tc>
+          <w:tcPr>
+            <w:tcW w:type="dxa" w:w="2880"/>
+          </w:tcPr>
+          <w:p>
+            <w:r>
+              <w:t>Staging / Online</w:t>
+            </w:r>
+          </w:p>
+        </w:tc>
+        <w:tc>
+          <w:tcPr>
+            <w:tcW w:type="dxa" w:w="2880"/>
+          </w:tcPr>
+          <w:p>
+            <w:r>
+              <w:t>https://test-gamma-azure-65.vercel.app</w:t>
+            </w:r>
+          </w:p>
+        </w:tc>
+        <w:tc>
+          <w:tcPr>
+            <w:tcW w:type="dxa" w:w="2880"/>
+          </w:tcPr>
+          <w:p>
+            <w:r>
+              <w:t>Kiểm thử chấp nhận trên môi trường thực tế</w:t>
+            </w:r>
+          </w:p>
+        </w:tc>
+      </w:tr>
+      <w:tr>
+        <w:tc>
+          <w:tcPr>
+            <w:tcW w:type="dxa" w:w="2880"/>
+          </w:tcPr>
+          <w:p>
+            <w:r>
+              <w:t>Cơ sở dữ liệu</w:t>
+            </w:r>
+          </w:p>
+        </w:tc>
+        <w:tc>
+          <w:tcPr>
+            <w:tcW w:type="dxa" w:w="2880"/>
+          </w:tcPr>
+          <w:p>
+            <w:r>
+              <w:t>PostgreSQL trên local và staging</w:t>
+            </w:r>
+          </w:p>
+        </w:tc>
+        <w:tc>
+          <w:tcPr>
+            <w:tcW w:type="dxa" w:w="2880"/>
+          </w:tcPr>
+          <w:p>
+            <w:r>
+              <w:t>Kiểm tra trạng thái dữ liệu sau thao tác</w:t>
+            </w:r>
+          </w:p>
+        </w:tc>
+      </w:tr>
+    </w:tbl>
+    <w:p>
+      <w:r>
+        <w:t>Ghi chú: môi trường Online đã được xác minh phản hồi HTTP 200 trong quá trình chuẩn bị Test Plan.</w:t>
+      </w:r>
+    </w:p>
+    <w:p>
+      <w:pPr>
+        <w:pStyle w:val="Heading2"/>
+      </w:pPr>
+      <w:r>
+        <w:t>5.2 Nền tảng và trình duyệt</w:t>
+      </w:r>
+    </w:p>
+    <w:tbl>
+      <w:tblPr>
+        <w:tblStyle w:val="TableGrid"/>
+        <w:tblW w:type="auto" w:w="0"/>
+        <w:tblLook w:firstColumn="1" w:firstRow="1" w:lastColumn="0" w:lastRow="0" w:noHBand="0" w:noVBand="1" w:val="04A0"/>
+      </w:tblPr>
+      <w:tblGrid>
+        <w:gridCol w:w="4320"/>
+        <w:gridCol w:w="4320"/>
+      </w:tblGrid>
+      <w:tr>
+        <w:tc>
+          <w:tcPr>
+            <w:tcW w:type="dxa" w:w="4320"/>
+          </w:tcPr>
+          <w:p>
+            <w:r>
+              <w:t>Hạng mục</w:t>
+            </w:r>
+          </w:p>
+        </w:tc>
+        <w:tc>
+          <w:tcPr>
+            <w:tcW w:type="dxa" w:w="4320"/>
+          </w:tcPr>
+          <w:p>
+            <w:r>
+              <w:t>Cấu hình</w:t>
+            </w:r>
+          </w:p>
+        </w:tc>
+      </w:tr>
+      <w:tr>
+        <w:tc>
+          <w:tcPr>
+            <w:tcW w:type="dxa" w:w="4320"/>
+          </w:tcPr>
+          <w:p>
+            <w:r>
+              <w:t>Hệ điều hành</w:t>
+            </w:r>
+          </w:p>
+        </w:tc>
+        <w:tc>
+          <w:tcPr>
+            <w:tcW w:type="dxa" w:w="4320"/>
+          </w:tcPr>
+          <w:p>
+            <w:r>
+              <w:t>Windows 11 (64-bit)</w:t>
+            </w:r>
+          </w:p>
+        </w:tc>
+      </w:tr>
+      <w:tr>
+        <w:tc>
+          <w:tcPr>
+            <w:tcW w:type="dxa" w:w="4320"/>
+          </w:tcPr>
+          <w:p>
+            <w:r>
+              <w:t>Trình duyệt chính</w:t>
+            </w:r>
+          </w:p>
+        </w:tc>
+        <w:tc>
+          <w:tcPr>
+            <w:tcW w:type="dxa" w:w="4320"/>
+          </w:tcPr>
+          <w:p>
+            <w:r>
+              <w:t>Google Chrome phiên bản mới nhất</w:t>
+            </w:r>
+          </w:p>
+        </w:tc>
+      </w:tr>
+      <w:tr>
+        <w:tc>
+          <w:tcPr>
+            <w:tcW w:type="dxa" w:w="4320"/>
+          </w:tcPr>
+          <w:p>
+            <w:r>
+              <w:t>Trình duyệt đối chiếu</w:t>
+            </w:r>
+          </w:p>
+        </w:tc>
+        <w:tc>
+          <w:tcPr>
+            <w:tcW w:type="dxa" w:w="4320"/>
+          </w:tcPr>
+          <w:p>
+            <w:r>
+              <w:t>Microsoft Edge và Firefox</w:t>
+            </w:r>
+          </w:p>
+        </w:tc>
+      </w:tr>
+      <w:tr>
+        <w:tc>
+          <w:tcPr>
+            <w:tcW w:type="dxa" w:w="4320"/>
+          </w:tcPr>
+          <w:p>
+            <w:r>
+              <w:t>Độ phân giải desktop</w:t>
+            </w:r>
+          </w:p>
+        </w:tc>
+        <w:tc>
+          <w:tcPr>
+            <w:tcW w:type="dxa" w:w="4320"/>
+          </w:tcPr>
+          <w:p>
+            <w:r>
+              <w:t>1366×768 và 1920×1080</w:t>
+            </w:r>
+          </w:p>
+        </w:tc>
+      </w:tr>
+      <w:tr>
+        <w:tc>
+          <w:tcPr>
+            <w:tcW w:type="dxa" w:w="4320"/>
+          </w:tcPr>
+          <w:p>
+            <w:r>
+              <w:t>Độ phân giải mobile</w:t>
+            </w:r>
+          </w:p>
+        </w:tc>
+        <w:tc>
+          <w:tcPr>
+            <w:tcW w:type="dxa" w:w="4320"/>
+          </w:tcPr>
+          <w:p>
+            <w:r>
+              <w:t>390×844</w:t>
+            </w:r>
+          </w:p>
+        </w:tc>
+      </w:tr>
+      <w:tr>
+        <w:tc>
+          <w:tcPr>
+            <w:tcW w:type="dxa" w:w="4320"/>
+          </w:tcPr>
+          <w:p>
+            <w:r>
+              <w:t>Mạng</w:t>
+            </w:r>
+          </w:p>
+        </w:tc>
+        <w:tc>
+          <w:tcPr>
+            <w:tcW w:type="dxa" w:w="4320"/>
+          </w:tcPr>
+          <w:p>
+            <w:r>
+              <w:t>Internet bình thường và mạng chậm để test đáp ứng</w:t>
+            </w:r>
+          </w:p>
+        </w:tc>
+      </w:tr>
+    </w:tbl>
+    <w:p>
+      <w:pPr>
+        <w:pStyle w:val="Heading2"/>
+      </w:pPr>
+      <w:r>
+        <w:t>5.3 Công cụ hỗ trợ</w:t>
       </w:r>
     </w:p>
     <w:p>
       <w:r>
-        <w:t>- Thiết bị: desktop phổ biến với độ phân giải 1366x768 trở lên.</w:t>
+        <w:t>- Quản lý kiểm thử: workbook Excel gồm Test Cases, Traceability Matrix, Test Execution và Bug Log.</w:t>
       </w:r>
     </w:p>
     <w:p>
       <w:r>
-        <w:t>- Hệ điều hành: Windows 10/11.</w:t>
+        <w:t>- Gỡ lỗi: Chrome DevTools (Console, Network).</w:t>
       </w:r>
     </w:p>
     <w:p>
       <w:r>
-        <w:t>- Backend: ứng dụng Next.js / API tương ứng với dự án.</w:t>
-      </w:r>
-    </w:p>
-    <w:p>
-      <w:r>
-        <w:t>- Database: PostgreSQL / SQL Server test environment.</w:t>
-      </w:r>
-    </w:p>
-    <w:p>
-      <w:r>
-        <w:t>- Mạng: kết nối Internet bình thường và một số kịch bản latency.</w:t>
+        <w:t>- Chụp minh chứng: screenshot, lưu video và ghi chú bước thực thi.</w:t>
       </w:r>
     </w:p>
     <w:p>
@@ -264,28 +950,538 @@
       </w:r>
     </w:p>
     <w:p>
+      <w:pPr>
+        <w:pStyle w:val="Heading2"/>
+      </w:pPr>
       <w:r>
-        <w:t>- Phương pháp: kiểm thử thủ công và kiểm thử chức năng cơ bản theo luồng người dùng.</w:t>
+        <w:t>6.1 Phương pháp quản lý</w:t>
       </w:r>
     </w:p>
     <w:p>
       <w:r>
-        <w:t>- Hộp đen: tập trung vào input/expected output mà không phụ thuộc vào code bên trong.</w:t>
+        <w:t>Nhóm áp dụng Agile theo chu kỳ sprint 2 tuần. Mỗi sprint đều có backlog kiểm thử, sprint planning, daily standup và review để cập nhật tình trạng lỗi và điều chỉnh ưu tiên.</w:t>
       </w:r>
     </w:p>
     <w:p>
       <w:r>
-        <w:t>- Phân vùng tương đương: kiểm tra nhóm dữ liệu hợp lệ và không hợp lệ.</w:t>
+        <w:t>- Backlog kiểm thử: 29 REQ, 33 TR và 75 TC được ưu tiên theo mức độ ảnh hưởng và tần suất sử dụng.</w:t>
       </w:r>
     </w:p>
     <w:p>
       <w:r>
-        <w:t>- Phân tích giá trị biên: kiểm tra giới hạn nhập liệu, số tiền, tối thiểu, thời gian campaign, số lượng reward.</w:t>
+        <w:t>- Sprint Planning: chọn các TC cần chạy cho từng vòng.</w:t>
       </w:r>
     </w:p>
     <w:p>
       <w:r>
-        <w:t>- Kiểm thử lỗi: nhập dữ liệu rỗng, sai định dạng, vượt quá giới hạn và trạng thái không hợp lệ.</w:t>
+        <w:t>- Daily standup: cập nhật lỗi, điểm chặn và kế hoạch chạy lại test case.</w:t>
+      </w:r>
+    </w:p>
+    <w:p>
+      <w:r>
+        <w:t>- Definition of Done: test case có Test Steps, Expected Result, Actual Result và Test Status; nếu Fail đã có Bug Log tương ứng.</w:t>
+      </w:r>
+    </w:p>
+    <w:p>
+      <w:pPr>
+        <w:pStyle w:val="Heading2"/>
+      </w:pPr>
+      <w:r>
+        <w:t>6.2 Loại kiểm thử áp dụng</w:t>
+      </w:r>
+    </w:p>
+    <w:tbl>
+      <w:tblPr>
+        <w:tblStyle w:val="TableGrid"/>
+        <w:tblW w:type="auto" w:w="0"/>
+        <w:tblLook w:firstColumn="1" w:firstRow="1" w:lastColumn="0" w:lastRow="0" w:noHBand="0" w:noVBand="1" w:val="04A0"/>
+      </w:tblPr>
+      <w:tblGrid>
+        <w:gridCol w:w="2880"/>
+        <w:gridCol w:w="2880"/>
+        <w:gridCol w:w="2880"/>
+      </w:tblGrid>
+      <w:tr>
+        <w:tc>
+          <w:tcPr>
+            <w:tcW w:type="dxa" w:w="2880"/>
+          </w:tcPr>
+          <w:p>
+            <w:r>
+              <w:t>Loại kiểm thử</w:t>
+            </w:r>
+          </w:p>
+        </w:tc>
+        <w:tc>
+          <w:tcPr>
+            <w:tcW w:type="dxa" w:w="2880"/>
+          </w:tcPr>
+          <w:p>
+            <w:r>
+              <w:t>Mục đích</w:t>
+            </w:r>
+          </w:p>
+        </w:tc>
+        <w:tc>
+          <w:tcPr>
+            <w:tcW w:type="dxa" w:w="2880"/>
+          </w:tcPr>
+          <w:p>
+            <w:r>
+              <w:t>Phạm vi áp dụng</w:t>
+            </w:r>
+          </w:p>
+        </w:tc>
+      </w:tr>
+      <w:tr>
+        <w:tc>
+          <w:tcPr>
+            <w:tcW w:type="dxa" w:w="2880"/>
+          </w:tcPr>
+          <w:p>
+            <w:r>
+              <w:t>Smoke Test</w:t>
+            </w:r>
+          </w:p>
+        </w:tc>
+        <w:tc>
+          <w:tcPr>
+            <w:tcW w:type="dxa" w:w="2880"/>
+          </w:tcPr>
+          <w:p>
+            <w:r>
+              <w:t>Xác nhận build cơ bản còn hoạt động</w:t>
+            </w:r>
+          </w:p>
+        </w:tc>
+        <w:tc>
+          <w:tcPr>
+            <w:tcW w:type="dxa" w:w="2880"/>
+          </w:tcPr>
+          <w:p>
+            <w:r>
+              <w:t>Đăng nhập, xem campaign, tạo campaign, tạo reward, blog, KYC, admin dashboard</w:t>
+            </w:r>
+          </w:p>
+        </w:tc>
+      </w:tr>
+      <w:tr>
+        <w:tc>
+          <w:tcPr>
+            <w:tcW w:type="dxa" w:w="2880"/>
+          </w:tcPr>
+          <w:p>
+            <w:r>
+              <w:t>Functional Test</w:t>
+            </w:r>
+          </w:p>
+        </w:tc>
+        <w:tc>
+          <w:tcPr>
+            <w:tcW w:type="dxa" w:w="2880"/>
+          </w:tcPr>
+          <w:p>
+            <w:r>
+              <w:t>Kiểm tra luồng nghiệp vụ</w:t>
+            </w:r>
+          </w:p>
+        </w:tc>
+        <w:tc>
+          <w:tcPr>
+            <w:tcW w:type="dxa" w:w="2880"/>
+          </w:tcPr>
+          <w:p>
+            <w:r>
+              <w:t>Tất cả 5 phân hệ</w:t>
+            </w:r>
+          </w:p>
+        </w:tc>
+      </w:tr>
+      <w:tr>
+        <w:tc>
+          <w:tcPr>
+            <w:tcW w:type="dxa" w:w="2880"/>
+          </w:tcPr>
+          <w:p>
+            <w:r>
+              <w:t>Validation Test</w:t>
+            </w:r>
+          </w:p>
+        </w:tc>
+        <w:tc>
+          <w:tcPr>
+            <w:tcW w:type="dxa" w:w="2880"/>
+          </w:tcPr>
+          <w:p>
+            <w:r>
+              <w:t>Xác minh ràng buộc dữ liệu và thông báo lỗi</w:t>
+            </w:r>
+          </w:p>
+        </w:tc>
+        <w:tc>
+          <w:tcPr>
+            <w:tcW w:type="dxa" w:w="2880"/>
+          </w:tcPr>
+          <w:p>
+            <w:r>
+              <w:t>Đăng ký, campaign, reward, upload tệp</w:t>
+            </w:r>
+          </w:p>
+        </w:tc>
+      </w:tr>
+      <w:tr>
+        <w:tc>
+          <w:tcPr>
+            <w:tcW w:type="dxa" w:w="2880"/>
+          </w:tcPr>
+          <w:p>
+            <w:r>
+              <w:t>Security Test</w:t>
+            </w:r>
+          </w:p>
+        </w:tc>
+        <w:tc>
+          <w:tcPr>
+            <w:tcW w:type="dxa" w:w="2880"/>
+          </w:tcPr>
+          <w:p>
+            <w:r>
+              <w:t>Kiểm tra phân quyền và dữ liệu nhạy cảm</w:t>
+            </w:r>
+          </w:p>
+        </w:tc>
+        <w:tc>
+          <w:tcPr>
+            <w:tcW w:type="dxa" w:w="2880"/>
+          </w:tcPr>
+          <w:p>
+            <w:r>
+              <w:t>Quyền truy cập, KYC, blog, campaign</w:t>
+            </w:r>
+          </w:p>
+        </w:tc>
+      </w:tr>
+      <w:tr>
+        <w:tc>
+          <w:tcPr>
+            <w:tcW w:type="dxa" w:w="2880"/>
+          </w:tcPr>
+          <w:p>
+            <w:r>
+              <w:t>UI Test</w:t>
+            </w:r>
+          </w:p>
+        </w:tc>
+        <w:tc>
+          <w:tcPr>
+            <w:tcW w:type="dxa" w:w="2880"/>
+          </w:tcPr>
+          <w:p>
+            <w:r>
+              <w:t>Kiểm thử giao diện và phản hồi</w:t>
+            </w:r>
+          </w:p>
+        </w:tc>
+        <w:tc>
+          <w:tcPr>
+            <w:tcW w:type="dxa" w:w="2880"/>
+          </w:tcPr>
+          <w:p>
+            <w:r>
+              <w:t>Trang công khai, hoạt động kéo/thả, trạng thái cho nhân</w:t>
+            </w:r>
+          </w:p>
+        </w:tc>
+      </w:tr>
+      <w:tr>
+        <w:tc>
+          <w:tcPr>
+            <w:tcW w:type="dxa" w:w="2880"/>
+          </w:tcPr>
+          <w:p>
+            <w:r>
+              <w:t>Regression Test</w:t>
+            </w:r>
+          </w:p>
+        </w:tc>
+        <w:tc>
+          <w:tcPr>
+            <w:tcW w:type="dxa" w:w="2880"/>
+          </w:tcPr>
+          <w:p>
+            <w:r>
+              <w:t>Đảm bảo sửa lỗi không gây lỗi mới</w:t>
+            </w:r>
+          </w:p>
+        </w:tc>
+        <w:tc>
+          <w:tcPr>
+            <w:tcW w:type="dxa" w:w="2880"/>
+          </w:tcPr>
+          <w:p>
+            <w:r>
+              <w:t>Các case mức High sau khi fix</w:t>
+            </w:r>
+          </w:p>
+        </w:tc>
+      </w:tr>
+      <w:tr>
+        <w:tc>
+          <w:tcPr>
+            <w:tcW w:type="dxa" w:w="2880"/>
+          </w:tcPr>
+          <w:p>
+            <w:r>
+              <w:t>Exploratory Test</w:t>
+            </w:r>
+          </w:p>
+        </w:tc>
+        <w:tc>
+          <w:tcPr>
+            <w:tcW w:type="dxa" w:w="2880"/>
+          </w:tcPr>
+          <w:p>
+            <w:r>
+              <w:t>Tìm lỗi ngoài kịch bản chuẩn</w:t>
+            </w:r>
+          </w:p>
+        </w:tc>
+        <w:tc>
+          <w:tcPr>
+            <w:tcW w:type="dxa" w:w="2880"/>
+          </w:tcPr>
+          <w:p>
+            <w:r>
+              <w:t>5 phiên 60 phút theo charter</w:t>
+            </w:r>
+          </w:p>
+        </w:tc>
+      </w:tr>
+    </w:tbl>
+    <w:p>
+      <w:pPr>
+        <w:pStyle w:val="Heading2"/>
+      </w:pPr>
+      <w:r>
+        <w:t>6.3 Kỹ thuật thiết kế test case</w:t>
+      </w:r>
+    </w:p>
+    <w:tbl>
+      <w:tblPr>
+        <w:tblStyle w:val="TableGrid"/>
+        <w:tblW w:type="auto" w:w="0"/>
+        <w:tblLook w:firstColumn="1" w:firstRow="1" w:lastColumn="0" w:lastRow="0" w:noHBand="0" w:noVBand="1" w:val="04A0"/>
+      </w:tblPr>
+      <w:tblGrid>
+        <w:gridCol w:w="2880"/>
+        <w:gridCol w:w="2880"/>
+        <w:gridCol w:w="2880"/>
+      </w:tblGrid>
+      <w:tr>
+        <w:tc>
+          <w:tcPr>
+            <w:tcW w:type="dxa" w:w="2880"/>
+          </w:tcPr>
+          <w:p>
+            <w:r>
+              <w:t>Kỹ thuật</w:t>
+            </w:r>
+          </w:p>
+        </w:tc>
+        <w:tc>
+          <w:tcPr>
+            <w:tcW w:type="dxa" w:w="2880"/>
+          </w:tcPr>
+          <w:p>
+            <w:r>
+              <w:t>Cách áp dụng</w:t>
+            </w:r>
+          </w:p>
+        </w:tc>
+        <w:tc>
+          <w:tcPr>
+            <w:tcW w:type="dxa" w:w="2880"/>
+          </w:tcPr>
+          <w:p>
+            <w:r>
+              <w:t>Ví dụ trong dự án</w:t>
+            </w:r>
+          </w:p>
+        </w:tc>
+      </w:tr>
+      <w:tr>
+        <w:tc>
+          <w:tcPr>
+            <w:tcW w:type="dxa" w:w="2880"/>
+          </w:tcPr>
+          <w:p>
+            <w:r>
+              <w:t>Phân vùng tương đương</w:t>
+            </w:r>
+          </w:p>
+        </w:tc>
+        <w:tc>
+          <w:tcPr>
+            <w:tcW w:type="dxa" w:w="2880"/>
+          </w:tcPr>
+          <w:p>
+            <w:r>
+              <w:t>Chia dữ liệu hợp lệ và không hợp lệ</w:t>
+            </w:r>
+          </w:p>
+        </w:tc>
+        <w:tc>
+          <w:tcPr>
+            <w:tcW w:type="dxa" w:w="2880"/>
+          </w:tcPr>
+          <w:p>
+            <w:r>
+              <w:t>Email đã tồn tại và chưa tồn tại khi đăng ký</w:t>
+            </w:r>
+          </w:p>
+        </w:tc>
+      </w:tr>
+      <w:tr>
+        <w:tc>
+          <w:tcPr>
+            <w:tcW w:type="dxa" w:w="2880"/>
+          </w:tcPr>
+          <w:p>
+            <w:r>
+              <w:t>Giá trị biên</w:t>
+            </w:r>
+          </w:p>
+        </w:tc>
+        <w:tc>
+          <w:tcPr>
+            <w:tcW w:type="dxa" w:w="2880"/>
+          </w:tcPr>
+          <w:p>
+            <w:r>
+              <w:t>Lấy giá trị dưới, đúng và trên ngưỡng</w:t>
+            </w:r>
+          </w:p>
+        </w:tc>
+        <w:tc>
+          <w:tcPr>
+            <w:tcW w:type="dxa" w:w="2880"/>
+          </w:tcPr>
+          <w:p>
+            <w:r>
+              <w:t>Mật khẩu 5/6/7 ký tự; goalAmount 0/âm</w:t>
+            </w:r>
+          </w:p>
+        </w:tc>
+      </w:tr>
+      <w:tr>
+        <w:tc>
+          <w:tcPr>
+            <w:tcW w:type="dxa" w:w="2880"/>
+          </w:tcPr>
+          <w:p>
+            <w:r>
+              <w:t>Bảng quyết định</w:t>
+            </w:r>
+          </w:p>
+        </w:tc>
+        <w:tc>
+          <w:tcPr>
+            <w:tcW w:type="dxa" w:w="2880"/>
+          </w:tcPr>
+          <w:p>
+            <w:r>
+              <w:t>Liệt kê điều kiện và hành động</w:t>
+            </w:r>
+          </w:p>
+        </w:tc>
+        <w:tc>
+          <w:tcPr>
+            <w:tcW w:type="dxa" w:w="2880"/>
+          </w:tcPr>
+          <w:p>
+            <w:r>
+              <w:t>Campaign có reward và không có reward</w:t>
+            </w:r>
+          </w:p>
+        </w:tc>
+      </w:tr>
+      <w:tr>
+        <w:tc>
+          <w:tcPr>
+            <w:tcW w:type="dxa" w:w="2880"/>
+          </w:tcPr>
+          <w:p>
+            <w:r>
+              <w:t>Chuyển trạng thái</w:t>
+            </w:r>
+          </w:p>
+        </w:tc>
+        <w:tc>
+          <w:tcPr>
+            <w:tcW w:type="dxa" w:w="2880"/>
+          </w:tcPr>
+          <w:p>
+            <w:r>
+              <w:t>Kiểm tra các trạng thái của workflow</w:t>
+            </w:r>
+          </w:p>
+        </w:tc>
+        <w:tc>
+          <w:tcPr>
+            <w:tcW w:type="dxa" w:w="2880"/>
+          </w:tcPr>
+          <w:p>
+            <w:r>
+              <w:t>Draft → Pending Review → Active → Success/Failed</w:t>
+            </w:r>
+          </w:p>
+        </w:tc>
+      </w:tr>
+    </w:tbl>
+    <w:p>
+      <w:pPr>
+        <w:pStyle w:val="Heading2"/>
+      </w:pPr>
+      <w:r>
+        <w:t>6.4 Công cụ và mức độ tự động hoá</w:t>
+      </w:r>
+    </w:p>
+    <w:p>
+      <w:r>
+        <w:t>- Quản lý kiểm thử: workbook Excel của nhóm.</w:t>
+      </w:r>
+    </w:p>
+    <w:p>
+      <w:r>
+        <w:t>- Jest: kiểm thử đơn vị và tích hợp tại các thư mục __tests__.</w:t>
+      </w:r>
+    </w:p>
+    <w:p>
+      <w:r>
+        <w:t>- Playwright: thực thi đặc tả e2e ở thư mục e2e, không đồng nghĩa với việc 75 TC trong workbook đã được tự động hóa.</w:t>
+      </w:r>
+    </w:p>
+    <w:p>
+      <w:r>
+        <w:t>- CI: GitHub Actions có sẵn để kiểm thử chất lượng và chạy Playwright ở mức tối thiểu, nhưng không thay thế cho bộ test case thủ công trong workbook.</w:t>
+      </w:r>
+    </w:p>
+    <w:p>
+      <w:pPr>
+        <w:pStyle w:val="Heading2"/>
+      </w:pPr>
+      <w:r>
+        <w:t>6.5 Kiểm thử khám phá</w:t>
+      </w:r>
+    </w:p>
+    <w:p>
+      <w:r>
+        <w:t>- Mỗi thành viên thực hiện một phiên exploratory 60 phút trên phân hệ mình phụ trách.</w:t>
+      </w:r>
+    </w:p>
+    <w:p>
+      <w:r>
+        <w:t>- Mọi phát hiện sẽ được ghi vào Bug Log với mã TC gần nhất hoặc ghi “Exploratory” nếu chưa có TC tương ứng.</w:t>
       </w:r>
     </w:p>
     <w:p>
@@ -297,18 +1493,137 @@
       </w:r>
     </w:p>
     <w:p>
+      <w:pPr>
+        <w:pStyle w:val="Heading2"/>
+      </w:pPr>
       <w:r>
-        <w:t>- Pass: chức năng thực hiện đúng theo yêu cầu, không phát sinh lỗi nghiêm trọng, giao diện phản hồi đúng với hành động người dùng.</w:t>
+        <w:t>7.1 Tiêu chí bắt đầu (Entry criteria)</w:t>
       </w:r>
     </w:p>
     <w:p>
       <w:r>
-        <w:t>- Fail: dữ liệu sai, không lưu được, không thông báo rõ ràng, không xử lý lỗi, hoặc dẫn đến trạng thái nghiêm trọng không thể phục hồi.</w:t>
+        <w:t>Một vòng kiểm thử chỉ bắt đầu khi các điều kiện sau thỏa mãn:</w:t>
       </w:r>
     </w:p>
     <w:p>
       <w:r>
-        <w:t>- Blocker: lỗi làm ngừng toàn bộ luồng nghiệp vụ chính như đăng ký, tạo campaign, đóng góp hoặc quản trị.</w:t>
+        <w:t>1. PRD và phạm vi 5 phân hệ đã được nhóm thống nhất.</w:t>
+      </w:r>
+    </w:p>
+    <w:p>
+      <w:r>
+        <w:t>2. Workbook có đủ Test Steps và Expected Result cho 100% test case trong vòng.</w:t>
+      </w:r>
+    </w:p>
+    <w:p>
+      <w:r>
+        <w:t>3. Mỗi test case đã được gán người phụ trách và mức ưu tiên.</w:t>
+      </w:r>
+    </w:p>
+    <w:p>
+      <w:r>
+        <w:t>4. Môi trường local và online ổn định và phản hồi HTTP 200.</w:t>
+      </w:r>
+    </w:p>
+    <w:p>
+      <w:r>
+        <w:t>5. Đã có đủ tài khoản kiểm thử: Guest, Backer, Creator, Creator chờ duyệt, Admin.</w:t>
+      </w:r>
+    </w:p>
+    <w:p>
+      <w:r>
+        <w:t>6. Dữ liệu kiểm thử đã được seed và không trùng với vòng trước.</w:t>
+      </w:r>
+    </w:p>
+    <w:p>
+      <w:r>
+        <w:t>7. Build đang chạy đã được ghi nhận rõ phiên bản để đối chiếu khi báo lỗi.</w:t>
+      </w:r>
+    </w:p>
+    <w:p>
+      <w:pPr>
+        <w:pStyle w:val="Heading2"/>
+      </w:pPr>
+      <w:r>
+        <w:t>7.2 Tiêu chí Pass / Fail</w:t>
+      </w:r>
+    </w:p>
+    <w:p>
+      <w:r>
+        <w:t>- Pass: chức năng đúng theo yêu cầu, không có lỗi nghiêm trọng và phản hồi người dùng đúng với hành động thực hiện.</w:t>
+      </w:r>
+    </w:p>
+    <w:p>
+      <w:r>
+        <w:t>- Fail: dữ liệu sai, không lưu được, không thông báo rõ ràng hoặc dẫn đến trạng thái không thể phục hồi.</w:t>
+      </w:r>
+    </w:p>
+    <w:p>
+      <w:r>
+        <w:t>- Blocker: lỗi ngăn toàn bộ luồng nghiệp vụ chính như đăng nhập, tạo campaign, ủng hộ, duyệt KYC hoặc admin.</w:t>
+      </w:r>
+    </w:p>
+    <w:p>
+      <w:pPr>
+        <w:pStyle w:val="Heading2"/>
+      </w:pPr>
+      <w:r>
+        <w:t>7.3 Tiêu chí tạm dừng và tiếp tục</w:t>
+      </w:r>
+    </w:p>
+    <w:p>
+      <w:r>
+        <w:t>Tạm dừng kiểm thử khi có một trong các điều kiện sau:</w:t>
+      </w:r>
+    </w:p>
+    <w:p>
+      <w:r>
+        <w:t>1. Môi trường online không truy cập được liên tục quá 4 giờ làm việc.</w:t>
+      </w:r>
+    </w:p>
+    <w:p>
+      <w:r>
+        <w:t>2. Phát hiện lỗi mức Blocker khiến luồng nghiệp vụ chính không thể tiếp tục.</w:t>
+      </w:r>
+    </w:p>
+    <w:p>
+      <w:r>
+        <w:t>3. Dữ liệu kiểm thử bị hỏng hoặc không thể seed lại trong buổi làm việc.</w:t>
+      </w:r>
+    </w:p>
+    <w:p>
+      <w:r>
+        <w:t>4. Không đăng nhập được với bất kỳ tài khoản kiểm thử nào.</w:t>
+      </w:r>
+    </w:p>
+    <w:p>
+      <w:r>
+        <w:t>5. Đã triển khai bản build mới trong lúc vòng test đang chạy.</w:t>
+      </w:r>
+    </w:p>
+    <w:p>
+      <w:r>
+        <w:t>Tiếp tục kiểm thử khi:</w:t>
+      </w:r>
+    </w:p>
+    <w:p>
+      <w:r>
+        <w:t>1. Môi trường đã phục hồi và xác minh được bằng HTTP 200.</w:t>
+      </w:r>
+    </w:p>
+    <w:p>
+      <w:r>
+        <w:t>2. Lỗi Blocker đã được sửa hoặc có workaround được Test Lead chấp thuận.</w:t>
+      </w:r>
+    </w:p>
+    <w:p>
+      <w:r>
+        <w:t>3. Dữ liệu đã được seed lại đúng mục 4.</w:t>
+      </w:r>
+    </w:p>
+    <w:p>
+      <w:r>
+        <w:t>4. Test Lead xác nhận tiếp tục và ghi mốc thời gian vào biên bản nhóm.</w:t>
       </w:r>
     </w:p>
     <w:p>
@@ -320,117 +1635,377 @@
       </w:r>
     </w:p>
     <w:p>
-      <w:pPr/>
+      <w:pPr>
+        <w:pStyle w:val="Heading2"/>
+      </w:pPr>
       <w:r>
         <w:t>8.1 Mục tiêu chất lượng</w:t>
       </w:r>
     </w:p>
+    <w:tbl>
+      <w:tblPr>
+        <w:tblStyle w:val="TableGrid"/>
+        <w:tblW w:type="auto" w:w="0"/>
+        <w:tblLook w:firstColumn="1" w:firstRow="1" w:lastColumn="0" w:lastRow="0" w:noHBand="0" w:noVBand="1" w:val="04A0"/>
+      </w:tblPr>
+      <w:tblGrid>
+        <w:gridCol w:w="2880"/>
+        <w:gridCol w:w="2880"/>
+        <w:gridCol w:w="2880"/>
+      </w:tblGrid>
+      <w:tr>
+        <w:tc>
+          <w:tcPr>
+            <w:tcW w:type="dxa" w:w="2880"/>
+          </w:tcPr>
+          <w:p>
+            <w:r>
+              <w:t>Mã</w:t>
+            </w:r>
+          </w:p>
+        </w:tc>
+        <w:tc>
+          <w:tcPr>
+            <w:tcW w:type="dxa" w:w="2880"/>
+          </w:tcPr>
+          <w:p>
+            <w:r>
+              <w:t>Mục tiêu</w:t>
+            </w:r>
+          </w:p>
+        </w:tc>
+        <w:tc>
+          <w:tcPr>
+            <w:tcW w:type="dxa" w:w="2880"/>
+          </w:tcPr>
+          <w:p>
+            <w:r>
+              <w:t>Chỉ số nghiệm thu</w:t>
+            </w:r>
+          </w:p>
+        </w:tc>
+      </w:tr>
+      <w:tr>
+        <w:tc>
+          <w:tcPr>
+            <w:tcW w:type="dxa" w:w="2880"/>
+          </w:tcPr>
+          <w:p>
+            <w:r>
+              <w:t>QC-01</w:t>
+            </w:r>
+          </w:p>
+        </w:tc>
+        <w:tc>
+          <w:tcPr>
+            <w:tcW w:type="dxa" w:w="2880"/>
+          </w:tcPr>
+          <w:p>
+            <w:r>
+              <w:t>Bao phủ Test Requirement</w:t>
+            </w:r>
+          </w:p>
+        </w:tc>
+        <w:tc>
+          <w:tcPr>
+            <w:tcW w:type="dxa" w:w="2880"/>
+          </w:tcPr>
+          <w:p>
+            <w:r>
+              <w:t>100% TR (33/33) có ít nhất một test case</w:t>
+            </w:r>
+          </w:p>
+        </w:tc>
+      </w:tr>
+      <w:tr>
+        <w:tc>
+          <w:tcPr>
+            <w:tcW w:type="dxa" w:w="2880"/>
+          </w:tcPr>
+          <w:p>
+            <w:r>
+              <w:t>QC-02</w:t>
+            </w:r>
+          </w:p>
+        </w:tc>
+        <w:tc>
+          <w:tcPr>
+            <w:tcW w:type="dxa" w:w="2880"/>
+          </w:tcPr>
+          <w:p>
+            <w:r>
+              <w:t>Bao phủ Requirement</w:t>
+            </w:r>
+          </w:p>
+        </w:tc>
+        <w:tc>
+          <w:tcPr>
+            <w:tcW w:type="dxa" w:w="2880"/>
+          </w:tcPr>
+          <w:p>
+            <w:r>
+              <w:t>100% REQ (29/29) có ít nhất một TR và một test case</w:t>
+            </w:r>
+          </w:p>
+        </w:tc>
+      </w:tr>
+      <w:tr>
+        <w:tc>
+          <w:tcPr>
+            <w:tcW w:type="dxa" w:w="2880"/>
+          </w:tcPr>
+          <w:p>
+            <w:r>
+              <w:t>QC-03</w:t>
+            </w:r>
+          </w:p>
+        </w:tc>
+        <w:tc>
+          <w:tcPr>
+            <w:tcW w:type="dxa" w:w="2880"/>
+          </w:tcPr>
+          <w:p>
+            <w:r>
+              <w:t>Thực thi test case ưu tiên cao</w:t>
+            </w:r>
+          </w:p>
+        </w:tc>
+        <w:tc>
+          <w:tcPr>
+            <w:tcW w:type="dxa" w:w="2880"/>
+          </w:tcPr>
+          <w:p>
+            <w:r>
+              <w:t>100% TC mức High được chạy và có kết quả</w:t>
+            </w:r>
+          </w:p>
+        </w:tc>
+      </w:tr>
+      <w:tr>
+        <w:tc>
+          <w:tcPr>
+            <w:tcW w:type="dxa" w:w="2880"/>
+          </w:tcPr>
+          <w:p>
+            <w:r>
+              <w:t>QC-04</w:t>
+            </w:r>
+          </w:p>
+        </w:tc>
+        <w:tc>
+          <w:tcPr>
+            <w:tcW w:type="dxa" w:w="2880"/>
+          </w:tcPr>
+          <w:p>
+            <w:r>
+              <w:t>Tỷ lệ đạt</w:t>
+            </w:r>
+          </w:p>
+        </w:tc>
+        <w:tc>
+          <w:tcPr>
+            <w:tcW w:type="dxa" w:w="2880"/>
+          </w:tcPr>
+          <w:p>
+            <w:r>
+              <w:t>Tỷ lệ Pass toàn bộ ≥ 90%</w:t>
+            </w:r>
+          </w:p>
+        </w:tc>
+      </w:tr>
+      <w:tr>
+        <w:tc>
+          <w:tcPr>
+            <w:tcW w:type="dxa" w:w="2880"/>
+          </w:tcPr>
+          <w:p>
+            <w:r>
+              <w:t>QC-05</w:t>
+            </w:r>
+          </w:p>
+        </w:tc>
+        <w:tc>
+          <w:tcPr>
+            <w:tcW w:type="dxa" w:w="2880"/>
+          </w:tcPr>
+          <w:p>
+            <w:r>
+              <w:t>Lỗi nghiêm trọng</w:t>
+            </w:r>
+          </w:p>
+        </w:tc>
+        <w:tc>
+          <w:tcPr>
+            <w:tcW w:type="dxa" w:w="2880"/>
+          </w:tcPr>
+          <w:p>
+            <w:r>
+              <w:t>0 lỗi Blocker/Critical còn mở ở các luồng must-have</w:t>
+            </w:r>
+          </w:p>
+        </w:tc>
+      </w:tr>
+      <w:tr>
+        <w:tc>
+          <w:tcPr>
+            <w:tcW w:type="dxa" w:w="2880"/>
+          </w:tcPr>
+          <w:p>
+            <w:r>
+              <w:t>QC-06</w:t>
+            </w:r>
+          </w:p>
+        </w:tc>
+        <w:tc>
+          <w:tcPr>
+            <w:tcW w:type="dxa" w:w="2880"/>
+          </w:tcPr>
+          <w:p>
+            <w:r>
+              <w:t>Truy vết lỗi</w:t>
+            </w:r>
+          </w:p>
+        </w:tc>
+        <w:tc>
+          <w:tcPr>
+            <w:tcW w:type="dxa" w:w="2880"/>
+          </w:tcPr>
+          <w:p>
+            <w:r>
+              <w:t>100% TC Fail có dòng tương ứng trong Bug Log</w:t>
+            </w:r>
+          </w:p>
+        </w:tc>
+      </w:tr>
+      <w:tr>
+        <w:tc>
+          <w:tcPr>
+            <w:tcW w:type="dxa" w:w="2880"/>
+          </w:tcPr>
+          <w:p>
+            <w:r>
+              <w:t>QC-07</w:t>
+            </w:r>
+          </w:p>
+        </w:tc>
+        <w:tc>
+          <w:tcPr>
+            <w:tcW w:type="dxa" w:w="2880"/>
+          </w:tcPr>
+          <w:p>
+            <w:r>
+              <w:t>Tính nhất quán tài liệu</w:t>
+            </w:r>
+          </w:p>
+        </w:tc>
+        <w:tc>
+          <w:tcPr>
+            <w:tcW w:type="dxa" w:w="2880"/>
+          </w:tcPr>
+          <w:p>
+            <w:r>
+              <w:t>Số REQ/TR/TC khớp với workbook và Traceability Matrix</w:t>
+            </w:r>
+          </w:p>
+        </w:tc>
+      </w:tr>
+      <w:tr>
+        <w:tc>
+          <w:tcPr>
+            <w:tcW w:type="dxa" w:w="2880"/>
+          </w:tcPr>
+          <w:p>
+            <w:r>
+              <w:t>QC-08</w:t>
+            </w:r>
+          </w:p>
+        </w:tc>
+        <w:tc>
+          <w:tcPr>
+            <w:tcW w:type="dxa" w:w="2880"/>
+          </w:tcPr>
+          <w:p>
+            <w:r>
+              <w:t>Tương thích giao diện</w:t>
+            </w:r>
+          </w:p>
+        </w:tc>
+        <w:tc>
+          <w:tcPr>
+            <w:tcW w:type="dxa" w:w="2880"/>
+          </w:tcPr>
+          <w:p>
+            <w:r>
+              <w:t>0 lỗi vỡ giao diện trên 390×844, 1366×768 và 1920×1080</w:t>
+            </w:r>
+          </w:p>
+        </w:tc>
+      </w:tr>
+    </w:tbl>
     <w:p>
-      <w:pPr/>
-      <w:r>
-        <w:t>- Bao phủ 100% Test Requirement (24 TR) bằng ít nhất một test case; tổng 54 test case cho 5 module.</w:t>
-      </w:r>
-    </w:p>
-    <w:p>
-      <w:pPr/>
-      <w:r>
-        <w:t>- Tỷ lệ Pass mục tiêu ≥ 90% cho các module đã hoàn thiện (Login, Reward).</w:t>
-      </w:r>
-    </w:p>
-    <w:p>
-      <w:pPr/>
-      <w:r>
-        <w:t>- 100% test case ưu tiên High phải được thực thi và có kết quả Pass/Fail kèm Actual Result.</w:t>
-      </w:r>
-    </w:p>
-    <w:p>
-      <w:pPr/>
-      <w:r>
-        <w:t>- Không còn lỗi mức Blocker/Critical ở các luồng must-have (đăng nhập, tạo campaign, reward, KYC) trước khi nghiệm thu.</w:t>
-      </w:r>
-    </w:p>
-    <w:p>
-      <w:pPr/>
-      <w:r>
-        <w:t>- Mọi test case Fail phải được ghi vào Bug Log kèm mức độ và trạng thái xử lý (Open/Fixed).</w:t>
-      </w:r>
-    </w:p>
-    <w:p>
-      <w:pPr/>
+      <w:pPr>
+        <w:pStyle w:val="Heading2"/>
+      </w:pPr>
       <w:r>
         <w:t>8.2 Tiêu chí hoàn thành (Exit criteria)</w:t>
       </w:r>
     </w:p>
     <w:p>
-      <w:pPr/>
       <w:r>
-        <w:t>- Đã chạy 100% test case (54/54) và ghi Actual Result, Test Status cho từng test case.</w:t>
+        <w:t>- Đã thực thi 100% test case trong phạm vi và ghi Actual Result, Test Status và Test Environment cho từng case.</w:t>
       </w:r>
     </w:p>
     <w:p>
-      <w:pPr/>
       <w:r>
-        <w:t>- Tỷ lệ Pass toàn bộ ≥ 90%; toàn bộ lỗi High/Critical đã sửa hoặc có cam kết thời gian sửa.</w:t>
+        <w:t>- Tỷ lệ Pass toàn bộ ≥ 90%.</w:t>
       </w:r>
     </w:p>
     <w:p>
-      <w:pPr/>
       <w:r>
-        <w:t>- Ma trận truy xuất REQ ↔ TR ↔ TC được cập nhật: 100% TR (24/24) và 100% TC (54/54) đã liên kết; 25/26 REQ có test case, riêng REQ-CAMP-006 ngoài phạm vi Phase 1 và được ghi rõ trong ma trận.</w:t>
+        <w:t>- Toàn bộ lỗi High/Critical đã được sửa hoặc có cam kết thời gian sửa cụ thể.</w:t>
       </w:r>
     </w:p>
     <w:p>
-      <w:pPr/>
       <w:r>
-        <w:t>- Test Report có đủ: tóm tắt kết quả, phân tích lỗi, đánh giá và khuyến nghị.</w:t>
+        <w:t>- Ma trận truy vết REQ ↔ TR ↔ TC cập nhật: 29/29 REQ, 33/33 TR và 75/75 TC đều có căn cứ kiểm thử.</w:t>
       </w:r>
     </w:p>
     <w:p>
-      <w:pPr/>
       <w:r>
-        <w:t>8.3 Tiêu chí tạm dừng (Suspend criteria)</w:t>
+        <w:t>- Test Report có đủ 4 phần: tóm tắt kết quả, phân tích lỗi, đánh giá chất lượng và khuyến nghị.</w:t>
       </w:r>
     </w:p>
     <w:p>
-      <w:pPr/>
       <w:r>
-        <w:t>- Môi trường demo/local không truy cập được trong hơn một buổi làm việc.</w:t>
+        <w:t>- Test Lead xác nhận ký vào mục 13.</w:t>
       </w:r>
     </w:p>
     <w:p>
-      <w:pPr/>
+      <w:pPr>
+        <w:pStyle w:val="Heading2"/>
+      </w:pPr>
       <w:r>
-        <w:t>- Phát hiện lỗi Blocker khiến không thể chạy tiếp luồng nghiệp vụ chính.</w:t>
+        <w:t>8.3 Tài nguyên và công cụ kiểm thử</w:t>
       </w:r>
     </w:p>
     <w:p>
-      <w:pPr/>
       <w:r>
-        <w:t>8.4 Tài nguyên và công cụ kiểm thử</w:t>
+        <w:t>- Quản lý kiểm thử: workbook Excel gồm Test Cases, Traceability Matrix, Test Execution, Bug Log.</w:t>
       </w:r>
     </w:p>
     <w:p>
-      <w:pPr/>
       <w:r>
-        <w:t>- Quản lý kiểm thử: Excel/Google Sheets (Test Cases, Traceability Matrix, Bug Log).</w:t>
+        <w:t>- Tự động hóa có sẵn trong repo: Jest và Playwright; đây là hỗ trợ, không thay thế cho bộ test case thủ công 75 TC.</w:t>
       </w:r>
     </w:p>
     <w:p>
-      <w:pPr/>
       <w:r>
-        <w:t>- Tự động hoá đã có trong repo: Jest (npm test), Playwright (Chromium) và CI .github/workflows/platform-ci.yml.</w:t>
+        <w:t>- Tài khoản kiểm thử: Guest, Backer, Creator (KYC pending/verified), Admin.</w:t>
       </w:r>
     </w:p>
     <w:p>
-      <w:pPr/>
       <w:r>
-        <w:t>- Tài khoản kiểm thử: Guest, Backer, Creator (KYC pending/approved), Admin.</w:t>
-      </w:r>
-    </w:p>
-    <w:p>
-      <w:pPr/>
-      <w:r>
-        <w:t>- Môi trường: Windows 10/11, Chrome phiên bản mới nhất, demo Vercel và local.</w:t>
+        <w:t>- Môi trường: Windows 11, Chrome/Edge/Firefox mới nhất, local và staging online.</w:t>
       </w:r>
     </w:p>
     <w:p>
@@ -439,6 +2014,533 @@
       </w:pPr>
       <w:r>
         <w:t>9. Kế hoạch thực hiện kiểm thử</w:t>
+      </w:r>
+    </w:p>
+    <w:p>
+      <w:pPr>
+        <w:pStyle w:val="Heading2"/>
+      </w:pPr>
+      <w:r>
+        <w:t>9.1 Lịch trình</w:t>
+      </w:r>
+    </w:p>
+    <w:tbl>
+      <w:tblPr>
+        <w:tblStyle w:val="TableGrid"/>
+        <w:tblW w:type="auto" w:w="0"/>
+        <w:tblLook w:firstColumn="1" w:firstRow="1" w:lastColumn="0" w:lastRow="0" w:noHBand="0" w:noVBand="1" w:val="04A0"/>
+      </w:tblPr>
+      <w:tblGrid>
+        <w:gridCol w:w="1440"/>
+        <w:gridCol w:w="1440"/>
+        <w:gridCol w:w="1440"/>
+        <w:gridCol w:w="1440"/>
+        <w:gridCol w:w="1440"/>
+        <w:gridCol w:w="1440"/>
+      </w:tblGrid>
+      <w:tr>
+        <w:tc>
+          <w:tcPr>
+            <w:tcW w:type="dxa" w:w="1440"/>
+          </w:tcPr>
+          <w:p>
+            <w:r>
+              <w:t>Giai đoạn</w:t>
+            </w:r>
+          </w:p>
+        </w:tc>
+        <w:tc>
+          <w:tcPr>
+            <w:tcW w:type="dxa" w:w="1440"/>
+          </w:tcPr>
+          <w:p>
+            <w:r>
+              <w:t>Thời gian</w:t>
+            </w:r>
+          </w:p>
+        </w:tc>
+        <w:tc>
+          <w:tcPr>
+            <w:tcW w:type="dxa" w:w="1440"/>
+          </w:tcPr>
+          <w:p>
+            <w:r>
+              <w:t>Nội dung công việc</w:t>
+            </w:r>
+          </w:p>
+        </w:tc>
+        <w:tc>
+          <w:tcPr>
+            <w:tcW w:type="dxa" w:w="1440"/>
+          </w:tcPr>
+          <w:p>
+            <w:r>
+              <w:t>Kết quả bàn giao</w:t>
+            </w:r>
+          </w:p>
+        </w:tc>
+        <w:tc>
+          <w:tcPr>
+            <w:tcW w:type="dxa" w:w="1440"/>
+          </w:tcPr>
+          <w:p>
+            <w:r>
+              <w:t>Người phụ trách</w:t>
+            </w:r>
+          </w:p>
+        </w:tc>
+        <w:tc>
+          <w:tcPr>
+            <w:tcW w:type="dxa" w:w="1440"/>
+          </w:tcPr>
+          <w:p>
+            <w:r>
+              <w:t>Số ngày công</w:t>
+            </w:r>
+          </w:p>
+        </w:tc>
+      </w:tr>
+      <w:tr>
+        <w:tc>
+          <w:tcPr>
+            <w:tcW w:type="dxa" w:w="1440"/>
+          </w:tcPr>
+          <w:p>
+            <w:r>
+              <w:t>Khởi tạo</w:t>
+            </w:r>
+          </w:p>
+        </w:tc>
+        <w:tc>
+          <w:tcPr>
+            <w:tcW w:type="dxa" w:w="1440"/>
+          </w:tcPr>
+          <w:p>
+            <w:r>
+              <w:t>07/09 – 13/09/2026</w:t>
+            </w:r>
+          </w:p>
+        </w:tc>
+        <w:tc>
+          <w:tcPr>
+            <w:tcW w:type="dxa" w:w="1440"/>
+          </w:tcPr>
+          <w:p>
+            <w:r>
+              <w:t>Phân tích PRD, xác định phạm vi 5 phân hệ</w:t>
+            </w:r>
+          </w:p>
+        </w:tc>
+        <w:tc>
+          <w:tcPr>
+            <w:tcW w:type="dxa" w:w="1440"/>
+          </w:tcPr>
+          <w:p>
+            <w:r>
+              <w:t>Mục 1, 2, 3 trong Test Plan</w:t>
+            </w:r>
+          </w:p>
+        </w:tc>
+        <w:tc>
+          <w:tcPr>
+            <w:tcW w:type="dxa" w:w="1440"/>
+          </w:tcPr>
+          <w:p>
+            <w:r>
+              <w:t>Nguyễn Quách Phú Tài</w:t>
+            </w:r>
+          </w:p>
+        </w:tc>
+        <w:tc>
+          <w:tcPr>
+            <w:tcW w:type="dxa" w:w="1440"/>
+          </w:tcPr>
+          <w:p>
+            <w:r>
+              <w:t>5</w:t>
+            </w:r>
+          </w:p>
+        </w:tc>
+      </w:tr>
+      <w:tr>
+        <w:tc>
+          <w:tcPr>
+            <w:tcW w:type="dxa" w:w="1440"/>
+          </w:tcPr>
+          <w:p>
+            <w:r>
+              <w:t>Thiết kế yêu cầu</w:t>
+            </w:r>
+          </w:p>
+        </w:tc>
+        <w:tc>
+          <w:tcPr>
+            <w:tcW w:type="dxa" w:w="1440"/>
+          </w:tcPr>
+          <w:p>
+            <w:r>
+              <w:t>14/09 – 20/09/2026</w:t>
+            </w:r>
+          </w:p>
+        </w:tc>
+        <w:tc>
+          <w:tcPr>
+            <w:tcW w:type="dxa" w:w="1440"/>
+          </w:tcPr>
+          <w:p>
+            <w:r>
+              <w:t>Tách 29 REQ thành 33 TR</w:t>
+            </w:r>
+          </w:p>
+        </w:tc>
+        <w:tc>
+          <w:tcPr>
+            <w:tcW w:type="dxa" w:w="1440"/>
+          </w:tcPr>
+          <w:p>
+            <w:r>
+              <w:t>33 TR trong workbook</w:t>
+            </w:r>
+          </w:p>
+        </w:tc>
+        <w:tc>
+          <w:tcPr>
+            <w:tcW w:type="dxa" w:w="1440"/>
+          </w:tcPr>
+          <w:p>
+            <w:r>
+              <w:t>Cả nhóm</w:t>
+            </w:r>
+          </w:p>
+        </w:tc>
+        <w:tc>
+          <w:tcPr>
+            <w:tcW w:type="dxa" w:w="1440"/>
+          </w:tcPr>
+          <w:p>
+            <w:r>
+              <w:t>10</w:t>
+            </w:r>
+          </w:p>
+        </w:tc>
+      </w:tr>
+      <w:tr>
+        <w:tc>
+          <w:tcPr>
+            <w:tcW w:type="dxa" w:w="1440"/>
+          </w:tcPr>
+          <w:p>
+            <w:r>
+              <w:t>Thiết kế test case</w:t>
+            </w:r>
+          </w:p>
+        </w:tc>
+        <w:tc>
+          <w:tcPr>
+            <w:tcW w:type="dxa" w:w="1440"/>
+          </w:tcPr>
+          <w:p>
+            <w:r>
+              <w:t>21/09 – 04/10/2026</w:t>
+            </w:r>
+          </w:p>
+        </w:tc>
+        <w:tc>
+          <w:tcPr>
+            <w:tcW w:type="dxa" w:w="1440"/>
+          </w:tcPr>
+          <w:p>
+            <w:r>
+              <w:t>Viết 75 TC với Test Steps, Test Data và Expected Result</w:t>
+            </w:r>
+          </w:p>
+        </w:tc>
+        <w:tc>
+          <w:tcPr>
+            <w:tcW w:type="dxa" w:w="1440"/>
+          </w:tcPr>
+          <w:p>
+            <w:r>
+              <w:t>75 TC theo từng phân hệ</w:t>
+            </w:r>
+          </w:p>
+        </w:tc>
+        <w:tc>
+          <w:tcPr>
+            <w:tcW w:type="dxa" w:w="1440"/>
+          </w:tcPr>
+          <w:p>
+            <w:r>
+              <w:t>Mỗi người 15 TC</w:t>
+            </w:r>
+          </w:p>
+        </w:tc>
+        <w:tc>
+          <w:tcPr>
+            <w:tcW w:type="dxa" w:w="1440"/>
+          </w:tcPr>
+          <w:p>
+            <w:r>
+              <w:t>14</w:t>
+            </w:r>
+          </w:p>
+        </w:tc>
+      </w:tr>
+      <w:tr>
+        <w:tc>
+          <w:tcPr>
+            <w:tcW w:type="dxa" w:w="1440"/>
+          </w:tcPr>
+          <w:p>
+            <w:r>
+              <w:t>Chuẩn bị dữ liệu</w:t>
+            </w:r>
+          </w:p>
+        </w:tc>
+        <w:tc>
+          <w:tcPr>
+            <w:tcW w:type="dxa" w:w="1440"/>
+          </w:tcPr>
+          <w:p>
+            <w:r>
+              <w:t>05/10 – 11/10/2026</w:t>
+            </w:r>
+          </w:p>
+        </w:tc>
+        <w:tc>
+          <w:tcPr>
+            <w:tcW w:type="dxa" w:w="1440"/>
+          </w:tcPr>
+          <w:p>
+            <w:r>
+              <w:t>Seed dữ liệu, tạo tài khoản, kiểm tra hai môi trường</w:t>
+            </w:r>
+          </w:p>
+        </w:tc>
+        <w:tc>
+          <w:tcPr>
+            <w:tcW w:type="dxa" w:w="1440"/>
+          </w:tcPr>
+          <w:p>
+            <w:r>
+              <w:t>Bộ dữ liệu theo mục 4</w:t>
+            </w:r>
+          </w:p>
+        </w:tc>
+        <w:tc>
+          <w:tcPr>
+            <w:tcW w:type="dxa" w:w="1440"/>
+          </w:tcPr>
+          <w:p>
+            <w:r>
+              <w:t>Bùi Đặng Quốc Khánh</w:t>
+            </w:r>
+          </w:p>
+        </w:tc>
+        <w:tc>
+          <w:tcPr>
+            <w:tcW w:type="dxa" w:w="1440"/>
+          </w:tcPr>
+          <w:p>
+            <w:r>
+              <w:t>5</w:t>
+            </w:r>
+          </w:p>
+        </w:tc>
+      </w:tr>
+      <w:tr>
+        <w:tc>
+          <w:tcPr>
+            <w:tcW w:type="dxa" w:w="1440"/>
+          </w:tcPr>
+          <w:p>
+            <w:r>
+              <w:t>Thực thi vòng 1</w:t>
+            </w:r>
+          </w:p>
+        </w:tc>
+        <w:tc>
+          <w:tcPr>
+            <w:tcW w:type="dxa" w:w="1440"/>
+          </w:tcPr>
+          <w:p>
+            <w:r>
+              <w:t>12/10 – 20/10/2026</w:t>
+            </w:r>
+          </w:p>
+        </w:tc>
+        <w:tc>
+          <w:tcPr>
+            <w:tcW w:type="dxa" w:w="1440"/>
+          </w:tcPr>
+          <w:p>
+            <w:r>
+              <w:t>Chạy bộ test case và ghi Actual Result</w:t>
+            </w:r>
+          </w:p>
+        </w:tc>
+        <w:tc>
+          <w:tcPr>
+            <w:tcW w:type="dxa" w:w="1440"/>
+          </w:tcPr>
+          <w:p>
+            <w:r>
+              <w:t>Test Execution &amp; Bug Log</w:t>
+            </w:r>
+          </w:p>
+        </w:tc>
+        <w:tc>
+          <w:tcPr>
+            <w:tcW w:type="dxa" w:w="1440"/>
+          </w:tcPr>
+          <w:p>
+            <w:r>
+              <w:t>Cả nhóm</w:t>
+            </w:r>
+          </w:p>
+        </w:tc>
+        <w:tc>
+          <w:tcPr>
+            <w:tcW w:type="dxa" w:w="1440"/>
+          </w:tcPr>
+          <w:p>
+            <w:r>
+              <w:t>12</w:t>
+            </w:r>
+          </w:p>
+        </w:tc>
+      </w:tr>
+      <w:tr>
+        <w:tc>
+          <w:tcPr>
+            <w:tcW w:type="dxa" w:w="1440"/>
+          </w:tcPr>
+          <w:p>
+            <w:r>
+              <w:t>Sửa lỗi</w:t>
+            </w:r>
+          </w:p>
+        </w:tc>
+        <w:tc>
+          <w:tcPr>
+            <w:tcW w:type="dxa" w:w="1440"/>
+          </w:tcPr>
+          <w:p>
+            <w:r>
+              <w:t>21/10 – 25/10/2026</w:t>
+            </w:r>
+          </w:p>
+        </w:tc>
+        <w:tc>
+          <w:tcPr>
+            <w:tcW w:type="dxa" w:w="1440"/>
+          </w:tcPr>
+          <w:p>
+            <w:r>
+              <w:t>Retest case Fail và kiểm tra fix</w:t>
+            </w:r>
+          </w:p>
+        </w:tc>
+        <w:tc>
+          <w:tcPr>
+            <w:tcW w:type="dxa" w:w="1440"/>
+          </w:tcPr>
+          <w:p>
+            <w:r>
+              <w:t>Bug Log cập nhật trạng thái</w:t>
+            </w:r>
+          </w:p>
+        </w:tc>
+        <w:tc>
+          <w:tcPr>
+            <w:tcW w:type="dxa" w:w="1440"/>
+          </w:tcPr>
+          <w:p>
+            <w:r>
+              <w:t>Cả nhóm</w:t>
+            </w:r>
+          </w:p>
+        </w:tc>
+        <w:tc>
+          <w:tcPr>
+            <w:tcW w:type="dxa" w:w="1440"/>
+          </w:tcPr>
+          <w:p>
+            <w:r>
+              <w:t>6</w:t>
+            </w:r>
+          </w:p>
+        </w:tc>
+      </w:tr>
+      <w:tr>
+        <w:tc>
+          <w:tcPr>
+            <w:tcW w:type="dxa" w:w="1440"/>
+          </w:tcPr>
+          <w:p>
+            <w:r>
+              <w:t>Tổng kết</w:t>
+            </w:r>
+          </w:p>
+        </w:tc>
+        <w:tc>
+          <w:tcPr>
+            <w:tcW w:type="dxa" w:w="1440"/>
+          </w:tcPr>
+          <w:p>
+            <w:r>
+              <w:t>26/10 – 27/10/2026</w:t>
+            </w:r>
+          </w:p>
+        </w:tc>
+        <w:tc>
+          <w:tcPr>
+            <w:tcW w:type="dxa" w:w="1440"/>
+          </w:tcPr>
+          <w:p>
+            <w:r>
+              <w:t>Chạy hồi quy, đối chiếu ma trận và báo cáo</w:t>
+            </w:r>
+          </w:p>
+        </w:tc>
+        <w:tc>
+          <w:tcPr>
+            <w:tcW w:type="dxa" w:w="1440"/>
+          </w:tcPr>
+          <w:p>
+            <w:r>
+              <w:t>Test Report</w:t>
+            </w:r>
+          </w:p>
+        </w:tc>
+        <w:tc>
+          <w:tcPr>
+            <w:tcW w:type="dxa" w:w="1440"/>
+          </w:tcPr>
+          <w:p>
+            <w:r>
+              <w:t>Nguyễn Khánh Du</w:t>
+            </w:r>
+          </w:p>
+        </w:tc>
+        <w:tc>
+          <w:tcPr>
+            <w:tcW w:type="dxa" w:w="1440"/>
+          </w:tcPr>
+          <w:p>
+            <w:r>
+              <w:t>3</w:t>
+            </w:r>
+          </w:p>
+        </w:tc>
+      </w:tr>
+    </w:tbl>
+    <w:p>
+      <w:pPr>
+        <w:pStyle w:val="Heading2"/>
+      </w:pPr>
+      <w:r>
+        <w:t>9.2 Nhân sự và phân công</w:t>
       </w:r>
     </w:p>
     <w:tbl>
@@ -460,7 +2562,7 @@
           </w:tcPr>
           <w:p>
             <w:r>
-              <w:t>Giai đoạn</w:t>
+              <w:t>Thành viên</w:t>
             </w:r>
           </w:p>
         </w:tc>
@@ -470,7 +2572,7 @@
           </w:tcPr>
           <w:p>
             <w:r>
-              <w:t>Nội dung</w:t>
+              <w:t>Phân hệ phụ trách</w:t>
             </w:r>
           </w:p>
         </w:tc>
@@ -480,7 +2582,7 @@
           </w:tcPr>
           <w:p>
             <w:r>
-              <w:t>Mục tiêu</w:t>
+              <w:t>Số TC</w:t>
             </w:r>
           </w:p>
         </w:tc>
@@ -490,7 +2592,7 @@
           </w:tcPr>
           <w:p>
             <w:r>
-              <w:t>Thời gian dự kiến</w:t>
+              <w:t>Nhiệm vụ</w:t>
             </w:r>
           </w:p>
         </w:tc>
@@ -502,7 +2604,7 @@
           </w:tcPr>
           <w:p>
             <w:r>
-              <w:t>Chuẩn bị</w:t>
+              <w:t>Nguyễn Quách Phú Tài</w:t>
             </w:r>
           </w:p>
         </w:tc>
@@ -512,7 +2614,7 @@
           </w:tcPr>
           <w:p>
             <w:r>
-              <w:t>Xác định phạm vi, dữ liệu, tài khoản test</w:t>
+              <w:t>Login (Auth)</w:t>
             </w:r>
           </w:p>
         </w:tc>
@@ -522,7 +2624,7 @@
           </w:tcPr>
           <w:p>
             <w:r>
-              <w:t>Đảm bảo môi trường sẵn sàng</w:t>
+              <w:t>15</w:t>
             </w:r>
           </w:p>
         </w:tc>
@@ -532,7 +2634,7 @@
           </w:tcPr>
           <w:p>
             <w:r>
-              <w:t>1 ngày</w:t>
+              <w:t>Test Lead, duyệt phạm vi và ký xác nhận</w:t>
             </w:r>
           </w:p>
         </w:tc>
@@ -544,7 +2646,7 @@
           </w:tcPr>
           <w:p>
             <w:r>
-              <w:t>Kiểm thử chức năng</w:t>
+              <w:t>Trần Xuân Ân</w:t>
             </w:r>
           </w:p>
         </w:tc>
@@ -554,7 +2656,7 @@
           </w:tcPr>
           <w:p>
             <w:r>
-              <w:t>Đăng ký, login, campaign, reward, pledge, KYC</w:t>
+              <w:t>Campaign</w:t>
             </w:r>
           </w:p>
         </w:tc>
@@ -564,7 +2666,7 @@
           </w:tcPr>
           <w:p>
             <w:r>
-              <w:t>Xác nhận luồng chính hoạt động</w:t>
+              <w:t>15</w:t>
             </w:r>
           </w:p>
         </w:tc>
@@ -574,7 +2676,7 @@
           </w:tcPr>
           <w:p>
             <w:r>
-              <w:t>2-3 ngày</w:t>
+              <w:t>Soạn test case và cập nhật traceability matrix</w:t>
             </w:r>
           </w:p>
         </w:tc>
@@ -586,7 +2688,7 @@
           </w:tcPr>
           <w:p>
             <w:r>
-              <w:t>Kiểm thử nghiệp vụ</w:t>
+              <w:t>Nguyễn Khánh Du</w:t>
             </w:r>
           </w:p>
         </w:tc>
@@ -596,7 +2698,7 @@
           </w:tcPr>
           <w:p>
             <w:r>
-              <w:t>Admin, báo cáo, Blog, bình luận, cập nhật</w:t>
+              <w:t>KYC</w:t>
             </w:r>
           </w:p>
         </w:tc>
@@ -606,7 +2708,7 @@
           </w:tcPr>
           <w:p>
             <w:r>
-              <w:t>Đảm bảo tính nhất quán nghiệp vụ</w:t>
+              <w:t>15</w:t>
             </w:r>
           </w:p>
         </w:tc>
@@ -616,7 +2718,7 @@
           </w:tcPr>
           <w:p>
             <w:r>
-              <w:t>2 ngày</w:t>
+              <w:t>Test case và tổng hợp Test Report</w:t>
             </w:r>
           </w:p>
         </w:tc>
@@ -628,7 +2730,7 @@
           </w:tcPr>
           <w:p>
             <w:r>
-              <w:t>Kiểm thử tổng hợp</w:t>
+              <w:t>Bùi Đặng Quốc Khánh</w:t>
             </w:r>
           </w:p>
         </w:tc>
@@ -638,7 +2740,7 @@
           </w:tcPr>
           <w:p>
             <w:r>
-              <w:t>Kiểm tra luồng end-to-end và xử lý lỗi</w:t>
+              <w:t>Reward</w:t>
             </w:r>
           </w:p>
         </w:tc>
@@ -648,7 +2750,7 @@
           </w:tcPr>
           <w:p>
             <w:r>
-              <w:t>Đánh giá khả năng sử dụng</w:t>
+              <w:t>15</w:t>
             </w:r>
           </w:p>
         </w:tc>
@@ -658,12 +2760,77 @@
           </w:tcPr>
           <w:p>
             <w:r>
-              <w:t>1-2 ngày</w:t>
+              <w:t>Chuẩn bị dữ liệu và phân mức lỗi</w:t>
+            </w:r>
+          </w:p>
+        </w:tc>
+      </w:tr>
+      <w:tr>
+        <w:tc>
+          <w:tcPr>
+            <w:tcW w:type="dxa" w:w="2160"/>
+          </w:tcPr>
+          <w:p>
+            <w:r>
+              <w:t>Nguyễn Trung Tiến</w:t>
+            </w:r>
+          </w:p>
+        </w:tc>
+        <w:tc>
+          <w:tcPr>
+            <w:tcW w:type="dxa" w:w="2160"/>
+          </w:tcPr>
+          <w:p>
+            <w:r>
+              <w:t>Blog</w:t>
+            </w:r>
+          </w:p>
+        </w:tc>
+        <w:tc>
+          <w:tcPr>
+            <w:tcW w:type="dxa" w:w="2160"/>
+          </w:tcPr>
+          <w:p>
+            <w:r>
+              <w:t>15</w:t>
+            </w:r>
+          </w:p>
+        </w:tc>
+        <w:tc>
+          <w:tcPr>
+            <w:tcW w:type="dxa" w:w="2160"/>
+          </w:tcPr>
+          <w:p>
+            <w:r>
+              <w:t>Kiểm thử blog và hỗ trợ Playwright</w:t>
             </w:r>
           </w:p>
         </w:tc>
       </w:tr>
     </w:tbl>
+    <w:p>
+      <w:pPr>
+        <w:pStyle w:val="Heading2"/>
+      </w:pPr>
+      <w:r>
+        <w:t>9.3 Vai trò và trách nhiệm</w:t>
+      </w:r>
+    </w:p>
+    <w:p>
+      <w:r>
+        <w:t>- Test Lead: chốt phạm vi, cấp phát test case, quyết định tạm dừng và tiếp tục, ký xác nhận cuối cùng.</w:t>
+      </w:r>
+    </w:p>
+    <w:p>
+      <w:r>
+        <w:t>- Tester: thực thi, ghi Actual Result, phát hiện lỗi, bổ sung dữ liệu test và cập nhật Bug Log.</w:t>
+      </w:r>
+    </w:p>
+    <w:p>
+      <w:r>
+        <w:t>- Reviewer: đối chiếu traceability và kết quả cuối cùng với mục tiêu chất lượng của dự án.</w:t>
+      </w:r>
+    </w:p>
     <w:p>
       <w:pPr>
         <w:pStyle w:val="Heading1"/>
@@ -674,68 +2841,27 @@
     </w:p>
     <w:p>
       <w:r>
-        <w:rPr>
-          <w:b/>
-        </w:rPr>
-        <w:t xml:space="preserve">Authentication &amp; profile: </w:t>
-      </w:r>
-      <w:r>
-        <w:t>Đăng ký, đăng nhập, đổi mật khẩu, hồ sơ cá nhân và xác thực tài khoản.</w:t>
+        <w:t>Authentication &amp; profile: đăng ký, đăng nhập, đổi mật khẩu, lưu hồ sơ, xác thực token và kiểm soát quyền người dùng.</w:t>
       </w:r>
     </w:p>
     <w:p>
       <w:r>
-        <w:rPr>
-          <w:b/>
-        </w:rPr>
-        <w:t xml:space="preserve">Campaign management: </w:t>
-      </w:r>
-      <w:r>
-        <w:t>Tạo chiến dịch, cập nhật thông tin, lưu nháp, công khai, đóng/hủy, kiểm tra trạng thái.</w:t>
+        <w:t>Campaign management: tạo chương trình, cập nhật thông tin, lưu nháp, duyệt, hủy, đóng chiến dịch và kiểm tra trạng thái.</w:t>
       </w:r>
     </w:p>
     <w:p>
       <w:r>
-        <w:rPr>
-          <w:b/>
-        </w:rPr>
-        <w:t xml:space="preserve">Reward &amp; pledge: </w:t>
-      </w:r>
-      <w:r>
-        <w:t>Thêm reward, đặt mức đóng góp, xác nhận quy trình hỗ trợ và hiển thị lịch sử.</w:t>
+        <w:t>Reward &amp; pledge: thêm reward, cập nhật gói quà, đối chiếu số lượng, xác nhận mức đóng góp và theo dõi lịch sử.</w:t>
       </w:r>
     </w:p>
     <w:p>
       <w:r>
-        <w:rPr>
-          <w:b/>
-        </w:rPr>
-        <w:t xml:space="preserve">KYC &amp; verification: </w:t>
-      </w:r>
-      <w:r>
-        <w:t>Gửi thông tin, duyệt từ chối, xác nhận danh tính và lưu trữ hồ sơ.</w:t>
+        <w:t>KYC &amp; verification: upload giấy tờ, xác minh thông tin, phê duyệt/từ chối và theo dõi tiến độ xử lý.</w:t>
       </w:r>
     </w:p>
     <w:p>
       <w:r>
-        <w:rPr>
-          <w:b/>
-        </w:rPr>
-        <w:t xml:space="preserve">Blog &amp; updates: </w:t>
-      </w:r>
-      <w:r>
-        <w:t>Soạn bài viết, cập nhật tiến độ, bình luận, đánh dấu bài nổi bật.</w:t>
-      </w:r>
-    </w:p>
-    <w:p>
-      <w:r>
-        <w:rPr>
-          <w:b/>
-        </w:rPr>
-        <w:t xml:space="preserve">Admin &amp; moderation: </w:t>
-      </w:r>
-      <w:r>
-        <w:t>Quản lý người dùng, báo cáo, campaign vi phạm, duyệt nội dung và audit logs.</w:t>
+        <w:t>Blog &amp; updates: tạo bài, kiểm duyệt, cập nhật trạng thái, nội dung và quyền hiển thị.</w:t>
       </w:r>
     </w:p>
     <w:p>
@@ -747,23 +2873,426 @@
       </w:r>
     </w:p>
     <w:p>
+      <w:pPr>
+        <w:pStyle w:val="Heading2"/>
+      </w:pPr>
       <w:r>
-        <w:t>- Một số chức năng thanh toán hoặc KYC có thể cần dữ liệu thật hoặc môi trường staging riêng.</w:t>
+        <w:t>11.1 Rủi ro và biện pháp giảm thiểu</w:t>
+      </w:r>
+    </w:p>
+    <w:tbl>
+      <w:tblPr>
+        <w:tblStyle w:val="TableGrid"/>
+        <w:tblW w:type="auto" w:w="0"/>
+        <w:tblLook w:firstColumn="1" w:firstRow="1" w:lastColumn="0" w:lastRow="0" w:noHBand="0" w:noVBand="1" w:val="04A0"/>
+      </w:tblPr>
+      <w:tblGrid>
+        <w:gridCol w:w="1440"/>
+        <w:gridCol w:w="1440"/>
+        <w:gridCol w:w="1440"/>
+        <w:gridCol w:w="1440"/>
+        <w:gridCol w:w="1440"/>
+        <w:gridCol w:w="1440"/>
+      </w:tblGrid>
+      <w:tr>
+        <w:tc>
+          <w:tcPr>
+            <w:tcW w:type="dxa" w:w="1440"/>
+          </w:tcPr>
+          <w:p>
+            <w:r>
+              <w:t>Mã</w:t>
+            </w:r>
+          </w:p>
+        </w:tc>
+        <w:tc>
+          <w:tcPr>
+            <w:tcW w:type="dxa" w:w="1440"/>
+          </w:tcPr>
+          <w:p>
+            <w:r>
+              <w:t>Rủi ro</w:t>
+            </w:r>
+          </w:p>
+        </w:tc>
+        <w:tc>
+          <w:tcPr>
+            <w:tcW w:type="dxa" w:w="1440"/>
+          </w:tcPr>
+          <w:p>
+            <w:r>
+              <w:t>Khả năng</w:t>
+            </w:r>
+          </w:p>
+        </w:tc>
+        <w:tc>
+          <w:tcPr>
+            <w:tcW w:type="dxa" w:w="1440"/>
+          </w:tcPr>
+          <w:p>
+            <w:r>
+              <w:t>Ảnh hưởng</w:t>
+            </w:r>
+          </w:p>
+        </w:tc>
+        <w:tc>
+          <w:tcPr>
+            <w:tcW w:type="dxa" w:w="1440"/>
+          </w:tcPr>
+          <w:p>
+            <w:r>
+              <w:t>Biện pháp giảm thiểu</w:t>
+            </w:r>
+          </w:p>
+        </w:tc>
+        <w:tc>
+          <w:tcPr>
+            <w:tcW w:type="dxa" w:w="1440"/>
+          </w:tcPr>
+          <w:p>
+            <w:r>
+              <w:t>Người theo dõi</w:t>
+            </w:r>
+          </w:p>
+        </w:tc>
+      </w:tr>
+      <w:tr>
+        <w:tc>
+          <w:tcPr>
+            <w:tcW w:type="dxa" w:w="1440"/>
+          </w:tcPr>
+          <w:p>
+            <w:r>
+              <w:t>R-01</w:t>
+            </w:r>
+          </w:p>
+        </w:tc>
+        <w:tc>
+          <w:tcPr>
+            <w:tcW w:type="dxa" w:w="1440"/>
+          </w:tcPr>
+          <w:p>
+            <w:r>
+              <w:t>Môi trường online chậm hoặc không ổn định</w:t>
+            </w:r>
+          </w:p>
+        </w:tc>
+        <w:tc>
+          <w:tcPr>
+            <w:tcW w:type="dxa" w:w="1440"/>
+          </w:tcPr>
+          <w:p>
+            <w:r>
+              <w:t>Trung bình</w:t>
+            </w:r>
+          </w:p>
+        </w:tc>
+        <w:tc>
+          <w:tcPr>
+            <w:tcW w:type="dxa" w:w="1440"/>
+          </w:tcPr>
+          <w:p>
+            <w:r>
+              <w:t>Cao</w:t>
+            </w:r>
+          </w:p>
+        </w:tc>
+        <w:tc>
+          <w:tcPr>
+            <w:tcW w:type="dxa" w:w="1440"/>
+          </w:tcPr>
+          <w:p>
+            <w:r>
+              <w:t>chuyển sang local khi online gián đoạn; ghi rõ môi trường trong Test Environment</w:t>
+            </w:r>
+          </w:p>
+        </w:tc>
+        <w:tc>
+          <w:tcPr>
+            <w:tcW w:type="dxa" w:w="1440"/>
+          </w:tcPr>
+          <w:p>
+            <w:r>
+              <w:t>Nguyễn Quách Phú Tài</w:t>
+            </w:r>
+          </w:p>
+        </w:tc>
+      </w:tr>
+      <w:tr>
+        <w:tc>
+          <w:tcPr>
+            <w:tcW w:type="dxa" w:w="1440"/>
+          </w:tcPr>
+          <w:p>
+            <w:r>
+              <w:t>R-02</w:t>
+            </w:r>
+          </w:p>
+        </w:tc>
+        <w:tc>
+          <w:tcPr>
+            <w:tcW w:type="dxa" w:w="1440"/>
+          </w:tcPr>
+          <w:p>
+            <w:r>
+              <w:t>Dữ liệu kiểm thử bị thay đổi giữa các vòng</w:t>
+            </w:r>
+          </w:p>
+        </w:tc>
+        <w:tc>
+          <w:tcPr>
+            <w:tcW w:type="dxa" w:w="1440"/>
+          </w:tcPr>
+          <w:p>
+            <w:r>
+              <w:t>Cao</w:t>
+            </w:r>
+          </w:p>
+        </w:tc>
+        <w:tc>
+          <w:tcPr>
+            <w:tcW w:type="dxa" w:w="1440"/>
+          </w:tcPr>
+          <w:p>
+            <w:r>
+              <w:t>Cao</w:t>
+            </w:r>
+          </w:p>
+        </w:tc>
+        <w:tc>
+          <w:tcPr>
+            <w:tcW w:type="dxa" w:w="1440"/>
+          </w:tcPr>
+          <w:p>
+            <w:r>
+              <w:t>seed lại dữ liệu trước mỗi vòng và ghi lại ID bản ghi</w:t>
+            </w:r>
+          </w:p>
+        </w:tc>
+        <w:tc>
+          <w:tcPr>
+            <w:tcW w:type="dxa" w:w="1440"/>
+          </w:tcPr>
+          <w:p>
+            <w:r>
+              <w:t>Bùi Đặng Quốc Khánh</w:t>
+            </w:r>
+          </w:p>
+        </w:tc>
+      </w:tr>
+      <w:tr>
+        <w:tc>
+          <w:tcPr>
+            <w:tcW w:type="dxa" w:w="1440"/>
+          </w:tcPr>
+          <w:p>
+            <w:r>
+              <w:t>R-03</w:t>
+            </w:r>
+          </w:p>
+        </w:tc>
+        <w:tc>
+          <w:tcPr>
+            <w:tcW w:type="dxa" w:w="1440"/>
+          </w:tcPr>
+          <w:p>
+            <w:r>
+              <w:t>Đối với KYC, dữ liệu thật hoặc cổng bên ngoài không sẵn sàng</w:t>
+            </w:r>
+          </w:p>
+        </w:tc>
+        <w:tc>
+          <w:tcPr>
+            <w:tcW w:type="dxa" w:w="1440"/>
+          </w:tcPr>
+          <w:p>
+            <w:r>
+              <w:t>Trung bình</w:t>
+            </w:r>
+          </w:p>
+        </w:tc>
+        <w:tc>
+          <w:tcPr>
+            <w:tcW w:type="dxa" w:w="1440"/>
+          </w:tcPr>
+          <w:p>
+            <w:r>
+              <w:t>Trung bình</w:t>
+            </w:r>
+          </w:p>
+        </w:tc>
+        <w:tc>
+          <w:tcPr>
+            <w:tcW w:type="dxa" w:w="1440"/>
+          </w:tcPr>
+          <w:p>
+            <w:r>
+              <w:t>dùng sandbox và chỉ kiểm tra ngưỡng, loại tệp, thông báo lỗi</w:t>
+            </w:r>
+          </w:p>
+        </w:tc>
+        <w:tc>
+          <w:tcPr>
+            <w:tcW w:type="dxa" w:w="1440"/>
+          </w:tcPr>
+          <w:p>
+            <w:r>
+              <w:t>Nguyễn Khánh Du</w:t>
+            </w:r>
+          </w:p>
+        </w:tc>
+      </w:tr>
+      <w:tr>
+        <w:tc>
+          <w:tcPr>
+            <w:tcW w:type="dxa" w:w="1440"/>
+          </w:tcPr>
+          <w:p>
+            <w:r>
+              <w:t>R-04</w:t>
+            </w:r>
+          </w:p>
+        </w:tc>
+        <w:tc>
+          <w:tcPr>
+            <w:tcW w:type="dxa" w:w="1440"/>
+          </w:tcPr>
+          <w:p>
+            <w:r>
+              <w:t>PRD không còn khớp với mã nguồn do thay đổi</w:t>
+            </w:r>
+          </w:p>
+        </w:tc>
+        <w:tc>
+          <w:tcPr>
+            <w:tcW w:type="dxa" w:w="1440"/>
+          </w:tcPr>
+          <w:p>
+            <w:r>
+              <w:t>Cao</w:t>
+            </w:r>
+          </w:p>
+        </w:tc>
+        <w:tc>
+          <w:tcPr>
+            <w:tcW w:type="dxa" w:w="1440"/>
+          </w:tcPr>
+          <w:p>
+            <w:r>
+              <w:t>Cao</w:t>
+            </w:r>
+          </w:p>
+        </w:tc>
+        <w:tc>
+          <w:tcPr>
+            <w:tcW w:type="dxa" w:w="1440"/>
+          </w:tcPr>
+          <w:p>
+            <w:r>
+              <w:t>đối chiếu trực tiếp với dữ liệu thực tế và cập nhật traceability</w:t>
+            </w:r>
+          </w:p>
+        </w:tc>
+        <w:tc>
+          <w:tcPr>
+            <w:tcW w:type="dxa" w:w="1440"/>
+          </w:tcPr>
+          <w:p>
+            <w:r>
+              <w:t>Nguyễn Quách Phú Tài</w:t>
+            </w:r>
+          </w:p>
+        </w:tc>
+      </w:tr>
+      <w:tr>
+        <w:tc>
+          <w:tcPr>
+            <w:tcW w:type="dxa" w:w="1440"/>
+          </w:tcPr>
+          <w:p>
+            <w:r>
+              <w:t>R-05</w:t>
+            </w:r>
+          </w:p>
+        </w:tc>
+        <w:tc>
+          <w:tcPr>
+            <w:tcW w:type="dxa" w:w="1440"/>
+          </w:tcPr>
+          <w:p>
+            <w:r>
+              <w:t>Thành viên bị chậm tiến độ theo tuần cao điểm</w:t>
+            </w:r>
+          </w:p>
+        </w:tc>
+        <w:tc>
+          <w:tcPr>
+            <w:tcW w:type="dxa" w:w="1440"/>
+          </w:tcPr>
+          <w:p>
+            <w:r>
+              <w:t>Trung bình</w:t>
+            </w:r>
+          </w:p>
+        </w:tc>
+        <w:tc>
+          <w:tcPr>
+            <w:tcW w:type="dxa" w:w="1440"/>
+          </w:tcPr>
+          <w:p>
+            <w:r>
+              <w:t>Cao</w:t>
+            </w:r>
+          </w:p>
+        </w:tc>
+        <w:tc>
+          <w:tcPr>
+            <w:tcW w:type="dxa" w:w="1440"/>
+          </w:tcPr>
+          <w:p>
+            <w:r>
+              <w:t>chia nhỏ theo phân hệ, ưu tiên chạy TC mức High trước</w:t>
+            </w:r>
+          </w:p>
+        </w:tc>
+        <w:tc>
+          <w:tcPr>
+            <w:tcW w:type="dxa" w:w="1440"/>
+          </w:tcPr>
+          <w:p>
+            <w:r>
+              <w:t>Trần Xuân Ân</w:t>
+            </w:r>
+          </w:p>
+        </w:tc>
+      </w:tr>
+    </w:tbl>
+    <w:p>
+      <w:pPr>
+        <w:pStyle w:val="Heading2"/>
+      </w:pPr>
+      <w:r>
+        <w:t>11.2 Giả định</w:t>
       </w:r>
     </w:p>
     <w:p>
       <w:r>
-        <w:t>- Một số trường hợp không hợp lệ cần được xác nhận dựa trên quy định chính xác của hệ thống.</w:t>
+        <w:t>- Cơ sở dữ liệu có đủ dữ liệu mẫu cho 5 phân hệ trong vòng kiểm thử.</w:t>
       </w:r>
     </w:p>
     <w:p>
       <w:r>
-        <w:t>- Tốc độ phản hồi của giao diện có thể thay đổi theo máy chủ và kết nối mạng.</w:t>
+        <w:t>- Có ít nhất 1 tài khoản Creator đã KYC và 1 tài khoản Admin để kiểm tra quyền chính.</w:t>
       </w:r>
     </w:p>
     <w:p>
       <w:r>
-        <w:t>- Dữ liệu test cần được làm sạch giữa các vòng kiểm thử để tránh sai lệch kết quả.</w:t>
+        <w:t>- Cổng thanh toán và eKYC chạy ở chế độ sandbox, không cần truy cập bên ngoài.</w:t>
+      </w:r>
+    </w:p>
+    <w:p>
+      <w:r>
+        <w:t>- Cả hai môi trường local và online dùng cùng một phiên bản build trong mỗi vòng thử nghiệm.</w:t>
       </w:r>
     </w:p>
     <w:p>
@@ -776,7 +3305,7 @@
     </w:p>
     <w:p>
       <w:r>
-        <w:t>Test Plan này bao phủ các luồng người dùng, nghiệp vụ chính và các rủi ro vận hành của hệ thống crowdfunding Tử Tế Fund. Nếu tất cả test case ưu tiên cao đạt yêu cầu Pass theo tiêu chí quy định, hệ thống được coi là đủ điều kiện để bước vào giai đoạn đánh giá và hoàn thiện tiếp theo.</w:t>
+        <w:t>Test Plan này xác định phạm vi kiểm thử cho 5 phân hệ chính — Login (Auth), Campaign, Reward, Blog và KYC — với 29 Requirement, 33 Test Requirement và 75 Test Case. Bằng cách giữ nguyên kế hoạch truy vết, quy trình seed dữ liệu và tiêu chí pass/fail, nhóm đảm bảo các yêu cầu quan trọng đều có bằng chứng kiểm thử rõ ràng, có thể lặp lại và phù hợp với mục tiêu nghiệm thu của dự án.</w:t>
       </w:r>
     </w:p>
     <w:p>
@@ -837,7 +3366,7 @@
           </w:tcPr>
           <w:p>
             <w:r>
-              <w:t>Trưởng nhóm</w:t>
+              <w:t>Test Lead</w:t>
             </w:r>
           </w:p>
         </w:tc>
@@ -937,7 +3466,7 @@
           </w:tcPr>
           <w:p>
             <w:r>
-              <w:t>Nguyễn Trung Tiến</w:t>
+              <w:t>Nguyễn Khánh Du</w:t>
             </w:r>
           </w:p>
         </w:tc>
@@ -967,7 +3496,7 @@
           </w:tcPr>
           <w:p>
             <w:r>
-              <w:t>Nguyễn Khánh Du</w:t>
+              <w:t>Nguyễn Trung Tiến</w:t>
             </w:r>
           </w:p>
         </w:tc>

</xml_diff>